<commit_message>
refactor: gdrive, europa, documents api
</commit_message>
<xml_diff>
--- a/sample_contracts/Dummy_1_PROFESSIONAL_SERVICE_AGREEMENT.docx
+++ b/sample_contracts/Dummy_1_PROFESSIONAL_SERVICE_AGREEMENT.docx
@@ -1,73 +1,91 @@
 
 <file path=word/document.xml><?xml version="1.0" encoding="utf-8"?>
-<w:document xmlns:mc="http://schemas.openxmlformats.org/markup-compatibility/2006" xmlns:o="urn:schemas-microsoft-com:office:office" xmlns:r="http://schemas.openxmlformats.org/officeDocument/2006/relationships" xmlns:m="http://schemas.openxmlformats.org/officeDocument/2006/math" xmlns:v="urn:schemas-microsoft-com:vml" xmlns:wp="http://schemas.openxmlformats.org/drawingml/2006/wordprocessingDrawing" xmlns:w10="urn:schemas-microsoft-com:office:word" xmlns:w="http://schemas.openxmlformats.org/wordprocessingml/2006/main" xmlns:wne="http://schemas.microsoft.com/office/word/2006/wordml" xmlns:sl="http://schemas.openxmlformats.org/schemaLibrary/2006/main" xmlns:a="http://schemas.openxmlformats.org/drawingml/2006/main" xmlns:pic="http://schemas.openxmlformats.org/drawingml/2006/picture" xmlns:c="http://schemas.openxmlformats.org/drawingml/2006/chart" xmlns:lc="http://schemas.openxmlformats.org/drawingml/2006/lockedCanvas" xmlns:dgm="http://schemas.openxmlformats.org/drawingml/2006/diagram" xmlns:wps="http://schemas.microsoft.com/office/word/2010/wordprocessingShape" xmlns:wpg="http://schemas.microsoft.com/office/word/2010/wordprocessingGroup" xmlns:w14="http://schemas.microsoft.com/office/word/2010/wordml" xmlns:w15="http://schemas.microsoft.com/office/word/2012/wordml" xmlns:w16="http://schemas.microsoft.com/office/word/2018/wordml" xmlns:w16cex="http://schemas.microsoft.com/office/word/2018/wordml/cex" xmlns:w16cid="http://schemas.microsoft.com/office/word/2016/wordml/cid" xmlns="http://schemas.microsoft.com/office/tasks/2019/documenttasks" xmlns:cr="http://schemas.microsoft.com/office/comments/2020/reactions">
+<w:document xmlns:wpc="http://schemas.microsoft.com/office/word/2010/wordprocessingCanvas" xmlns:cx="http://schemas.microsoft.com/office/drawing/2014/chartex" xmlns:cx1="http://schemas.microsoft.com/office/drawing/2015/9/8/chartex" xmlns:cx2="http://schemas.microsoft.com/office/drawing/2015/10/21/chartex" xmlns:cx3="http://schemas.microsoft.com/office/drawing/2016/5/9/chartex" xmlns:cx4="http://schemas.microsoft.com/office/drawing/2016/5/10/chartex" xmlns:cx5="http://schemas.microsoft.com/office/drawing/2016/5/11/chartex" xmlns:cx6="http://schemas.microsoft.com/office/drawing/2016/5/12/chartex" xmlns:cx7="http://schemas.microsoft.com/office/drawing/2016/5/13/chartex" xmlns:cx8="http://schemas.microsoft.com/office/drawing/2016/5/14/chartex" xmlns:mc="http://schemas.openxmlformats.org/markup-compatibility/2006" xmlns:aink="http://schemas.microsoft.com/office/drawing/2016/ink" xmlns:am3d="http://schemas.microsoft.com/office/drawing/2017/model3d" xmlns:o="urn:schemas-microsoft-com:office:office" xmlns:oel="http://schemas.microsoft.com/office/2019/extlst" xmlns:r="http://schemas.openxmlformats.org/officeDocument/2006/relationships" xmlns:m="http://schemas.openxmlformats.org/officeDocument/2006/math" xmlns:v="urn:schemas-microsoft-com:vml" xmlns:wp14="http://schemas.microsoft.com/office/word/2010/wordprocessingDrawing" xmlns:wp="http://schemas.openxmlformats.org/drawingml/2006/wordprocessingDrawing" xmlns:w10="urn:schemas-microsoft-com:office:word" xmlns:w="http://schemas.openxmlformats.org/wordprocessingml/2006/main" xmlns:w14="http://schemas.microsoft.com/office/word/2010/wordml" xmlns:w15="http://schemas.microsoft.com/office/word/2012/wordml" xmlns:w16cex="http://schemas.microsoft.com/office/word/2018/wordml/cex" xmlns:w16cid="http://schemas.microsoft.com/office/word/2016/wordml/cid" xmlns:w16="http://schemas.microsoft.com/office/word/2018/wordml" xmlns:w16du="http://schemas.microsoft.com/office/word/2023/wordml/word16du" xmlns:w16sdtdh="http://schemas.microsoft.com/office/word/2020/wordml/sdtdatahash" xmlns:w16sdtfl="http://schemas.microsoft.com/office/word/2024/wordml/sdtformatlock" xmlns:w16se="http://schemas.microsoft.com/office/word/2015/wordml/symex" xmlns:wpg="http://schemas.microsoft.com/office/word/2010/wordprocessingGroup" xmlns:wpi="http://schemas.microsoft.com/office/word/2010/wordprocessingInk" xmlns:wne="http://schemas.microsoft.com/office/word/2006/wordml" xmlns:wps="http://schemas.microsoft.com/office/word/2010/wordprocessingShape" mc:Ignorable="w14 w15 w16se w16cid w16 w16cex w16sdtdh w16sdtfl w16du wp14">
   <w:body>
     <w:p>
       <w:pPr>
         <w:pStyle w:val="Heading2"/>
         <w:keepNext w:val="0"/>
         <w:keepLines w:val="0"/>
-        <w:spacing w:after="80" w:lineRule="auto"/>
-        <w:rPr>
-          <w:b w:val="1"/>
-          <w:bCs w:val="1"/>
+        <w:spacing w:after="80"/>
+        <w:rPr>
+          <w:b/>
+          <w:bCs/>
           <w:sz w:val="34"/>
           <w:szCs w:val="34"/>
         </w:rPr>
       </w:pPr>
-      <w:bookmarkStart w:colFirst="0" w:colLast="0" w:name="_7cuzw6pu1ypn" w:id="0"/>
+      <w:bookmarkStart w:id="0" w:name="_7cuzw6pu1ypn" w:colFirst="0" w:colLast="0"/>
       <w:bookmarkEnd w:id="0"/>
       <w:r>
         <w:rPr>
-          <w:b w:val="1"/>
-          <w:bCs w:val="1"/>
+          <w:b/>
+          <w:bCs/>
           <w:sz w:val="34"/>
           <w:szCs w:val="34"/>
-          <w:rtl w:val="0"/>
-        </w:rPr>
-        <w:t xml:space="preserve">PROFESSIONAL SERVICE AGREEMENT</w:t>
-      </w:r>
-    </w:p>
-    <w:p>
-      <w:pPr>
-        <w:spacing w:after="240" w:before="240" w:lineRule="auto"/>
-        <w:rPr>
-          <w:b w:val="1"/>
-          <w:bCs w:val="1"/>
-        </w:rPr>
-      </w:pPr>
-      <w:r>
-        <w:rPr>
-          <w:b w:val="1"/>
-          <w:bCs w:val="1"/>
-          <w:rtl w:val="0"/>
-        </w:rPr>
-        <w:t xml:space="preserve">Dienstleistungsvertrag</w:t>
-      </w:r>
-    </w:p>
-    <w:p>
-      <w:pPr>
-        <w:spacing w:after="240" w:before="240" w:lineRule="auto"/>
-        <w:rPr/>
-      </w:pPr>
-      <w:r>
-        <w:rPr>
-          <w:rtl w:val="0"/>
-        </w:rPr>
+        </w:rPr>
+        <w:t>PROFESSIONAL SERVICE AGREEMENT</w:t>
+      </w:r>
+    </w:p>
+    <w:p>
+      <w:pPr>
+        <w:spacing w:before="240" w:after="240"/>
+        <w:rPr>
+          <w:b/>
+          <w:bCs/>
+        </w:rPr>
+      </w:pPr>
+      <w:r>
+        <w:rPr>
+          <w:b/>
+          <w:bCs/>
+        </w:rPr>
+        <w:t>Dienstleistungsvertrag</w:t>
+      </w:r>
+    </w:p>
+    <w:p>
+      <w:pPr>
+        <w:spacing w:before="240" w:after="240"/>
+      </w:pPr>
+      <w:r>
         <w:t xml:space="preserve">This Professional Service Agreement (the "Agreement") is entered into as of </w:t>
       </w:r>
       <w:r>
         <w:rPr>
-          <w:b w:val="1"/>
-          <w:bCs w:val="1"/>
-          <w:rtl w:val="0"/>
-        </w:rPr>
-        <w:t xml:space="preserve">July 24, 2025</w:t>
-      </w:r>
-      <w:r>
-        <w:rPr>
-          <w:rtl w:val="0"/>
-        </w:rPr>
+          <w:b/>
+          <w:bCs/>
+        </w:rPr>
+        <w:t>Ju</w:t>
+      </w:r>
+      <w:r>
+        <w:rPr>
+          <w:b/>
+          <w:bCs/>
+        </w:rPr>
+        <w:t>ne</w:t>
+      </w:r>
+      <w:r>
+        <w:rPr>
+          <w:b/>
+          <w:bCs/>
+        </w:rPr>
+        <w:t xml:space="preserve"> 2</w:t>
+      </w:r>
+      <w:r>
+        <w:rPr>
+          <w:b/>
+          <w:bCs/>
+        </w:rPr>
+        <w:t>3</w:t>
+      </w:r>
+      <w:r>
+        <w:rPr>
+          <w:b/>
+          <w:bCs/>
+        </w:rPr>
+        <w:t>, 2025</w:t>
+      </w:r>
+      <w:r>
         <w:t xml:space="preserve"> (the "Effective Date").</w:t>
       </w:r>
     </w:p>
@@ -76,61 +94,51 @@
         <w:pStyle w:val="Heading3"/>
         <w:keepNext w:val="0"/>
         <w:keepLines w:val="0"/>
-        <w:spacing w:before="280" w:lineRule="auto"/>
-        <w:rPr>
-          <w:b w:val="1"/>
-          <w:bCs w:val="1"/>
+        <w:spacing w:before="280"/>
+        <w:rPr>
+          <w:b/>
+          <w:bCs/>
           <w:color w:val="000000"/>
           <w:sz w:val="26"/>
           <w:szCs w:val="26"/>
         </w:rPr>
       </w:pPr>
-      <w:bookmarkStart w:colFirst="0" w:colLast="0" w:name="_jz53slaspkc1" w:id="1"/>
+      <w:bookmarkStart w:id="1" w:name="_jz53slaspkc1" w:colFirst="0" w:colLast="0"/>
       <w:bookmarkEnd w:id="1"/>
       <w:r>
         <w:rPr>
-          <w:b w:val="1"/>
-          <w:bCs w:val="1"/>
+          <w:b/>
+          <w:bCs/>
           <w:color w:val="000000"/>
           <w:sz w:val="26"/>
           <w:szCs w:val="26"/>
-          <w:rtl w:val="0"/>
-        </w:rPr>
-        <w:t xml:space="preserve">BETWEEN:</w:t>
-      </w:r>
-    </w:p>
-    <w:p>
-      <w:pPr>
-        <w:spacing w:after="240" w:before="240" w:lineRule="auto"/>
-        <w:rPr/>
-      </w:pPr>
-      <w:r>
-        <w:rPr>
-          <w:b w:val="1"/>
-          <w:bCs w:val="1"/>
-          <w:rtl w:val="0"/>
-        </w:rPr>
-        <w:t xml:space="preserve">mnb</w:t>
-      </w:r>
-      <w:r>
-        <w:rPr>
-          <w:rtl w:val="0"/>
-        </w:rPr>
+        </w:rPr>
+        <w:t>BETWEEN:</w:t>
+      </w:r>
+    </w:p>
+    <w:p>
+      <w:pPr>
+        <w:spacing w:before="240" w:after="240"/>
+      </w:pPr>
+      <w:r>
+        <w:rPr>
+          <w:b/>
+          <w:bCs/>
+        </w:rPr>
+        <w:t>mnb</w:t>
+      </w:r>
+      <w:r>
         <w:t xml:space="preserve">, a company incorporated under the laws of Germany, located at [Address], Germany (the </w:t>
       </w:r>
       <w:r>
         <w:rPr>
-          <w:b w:val="1"/>
-          <w:bCs w:val="1"/>
-          <w:rtl w:val="0"/>
-        </w:rPr>
-        <w:t xml:space="preserve">"Client"</w:t>
-      </w:r>
-      <w:r>
-        <w:rPr>
-          <w:rtl w:val="0"/>
-        </w:rPr>
-        <w:t xml:space="preserve">).</w:t>
+          <w:b/>
+          <w:bCs/>
+        </w:rPr>
+        <w:t>"Client"</w:t>
+      </w:r>
+      <w:r>
+        <w:t>).</w:t>
       </w:r>
     </w:p>
     <w:p>
@@ -138,76 +146,61 @@
         <w:pStyle w:val="Heading3"/>
         <w:keepNext w:val="0"/>
         <w:keepLines w:val="0"/>
-        <w:spacing w:before="280" w:lineRule="auto"/>
-        <w:rPr>
-          <w:b w:val="1"/>
-          <w:bCs w:val="1"/>
+        <w:spacing w:before="280"/>
+        <w:rPr>
+          <w:b/>
+          <w:bCs/>
           <w:color w:val="000000"/>
           <w:sz w:val="26"/>
           <w:szCs w:val="26"/>
         </w:rPr>
       </w:pPr>
-      <w:bookmarkStart w:colFirst="0" w:colLast="0" w:name="_rbuktjjzzynz" w:id="2"/>
+      <w:bookmarkStart w:id="2" w:name="_rbuktjjzzynz" w:colFirst="0" w:colLast="0"/>
       <w:bookmarkEnd w:id="2"/>
       <w:r>
         <w:rPr>
-          <w:b w:val="1"/>
-          <w:bCs w:val="1"/>
+          <w:b/>
+          <w:bCs/>
           <w:color w:val="000000"/>
           <w:sz w:val="26"/>
           <w:szCs w:val="26"/>
-          <w:rtl w:val="0"/>
-        </w:rPr>
-        <w:t xml:space="preserve">AND:</w:t>
-      </w:r>
-    </w:p>
-    <w:p>
-      <w:pPr>
-        <w:spacing w:after="240" w:before="240" w:lineRule="auto"/>
-        <w:rPr/>
-      </w:pPr>
-      <w:r>
-        <w:rPr>
-          <w:b w:val="1"/>
-          <w:bCs w:val="1"/>
-          <w:rtl w:val="0"/>
-        </w:rPr>
-        <w:t xml:space="preserve">lfg</w:t>
-      </w:r>
-      <w:r>
-        <w:rPr>
-          <w:rtl w:val="0"/>
-        </w:rPr>
+        </w:rPr>
+        <w:t>AND:</w:t>
+      </w:r>
+    </w:p>
+    <w:p>
+      <w:pPr>
+        <w:spacing w:before="240" w:after="240"/>
+      </w:pPr>
+      <w:r>
+        <w:rPr>
+          <w:b/>
+          <w:bCs/>
+        </w:rPr>
+        <w:t>lfg</w:t>
+      </w:r>
+      <w:r>
         <w:t xml:space="preserve">, a company incorporated under the laws of New York, located at [Address], New York, USA (the </w:t>
       </w:r>
       <w:r>
         <w:rPr>
-          <w:b w:val="1"/>
-          <w:bCs w:val="1"/>
-          <w:rtl w:val="0"/>
-        </w:rPr>
-        <w:t xml:space="preserve">"Provider"</w:t>
-      </w:r>
-      <w:r>
-        <w:rPr>
-          <w:rtl w:val="0"/>
-        </w:rPr>
-        <w:t xml:space="preserve">).</w:t>
-      </w:r>
-    </w:p>
-    <w:p>
-      <w:pPr>
-        <w:rPr/>
-      </w:pPr>
-      <w:r>
-        <w:pict>
-          <v:rect style="width:0.0pt;height:1.5pt" o:hr="t" o:hrstd="t" o:hralign="center" fillcolor="#A0A0A0" stroked="f"/>
+          <w:b/>
+          <w:bCs/>
+        </w:rPr>
+        <w:t>"Provider"</w:t>
+      </w:r>
+      <w:r>
+        <w:t>).</w:t>
+      </w:r>
+    </w:p>
+    <w:p>
+      <w:r>
+        <w:rPr>
+          <w:noProof/>
+        </w:rPr>
+        <w:pict w14:anchorId="469F3F4F">
+          <v:rect id="_x0000_i1025" alt="" style="width:468pt;height:.05pt;mso-width-percent:0;mso-height-percent:0;mso-width-percent:0;mso-height-percent:0" o:hralign="center" o:hrstd="t" o:hr="t" fillcolor="#a0a0a0" stroked="f"/>
         </w:pict>
-      </w:r>
-      <w:r>
-        <w:rPr>
-          <w:rtl w:val="0"/>
-        </w:rPr>
       </w:r>
     </w:p>
     <w:p>
@@ -215,39 +208,34 @@
         <w:pStyle w:val="Heading3"/>
         <w:keepNext w:val="0"/>
         <w:keepLines w:val="0"/>
-        <w:spacing w:before="280" w:lineRule="auto"/>
-        <w:rPr>
-          <w:b w:val="1"/>
-          <w:bCs w:val="1"/>
+        <w:spacing w:before="280"/>
+        <w:rPr>
+          <w:b/>
+          <w:bCs/>
           <w:color w:val="000000"/>
           <w:sz w:val="26"/>
           <w:szCs w:val="26"/>
         </w:rPr>
       </w:pPr>
-      <w:bookmarkStart w:colFirst="0" w:colLast="0" w:name="_z3pvox378hz5" w:id="3"/>
+      <w:bookmarkStart w:id="3" w:name="_z3pvox378hz5" w:colFirst="0" w:colLast="0"/>
       <w:bookmarkEnd w:id="3"/>
       <w:r>
         <w:rPr>
-          <w:b w:val="1"/>
-          <w:bCs w:val="1"/>
+          <w:b/>
+          <w:bCs/>
           <w:color w:val="000000"/>
           <w:sz w:val="26"/>
           <w:szCs w:val="26"/>
-          <w:rtl w:val="0"/>
-        </w:rPr>
-        <w:t xml:space="preserve">1. Scope of Services</w:t>
-      </w:r>
-    </w:p>
-    <w:p>
-      <w:pPr>
-        <w:spacing w:after="240" w:before="240" w:lineRule="auto"/>
-        <w:rPr/>
-      </w:pPr>
-      <w:r>
-        <w:rPr>
-          <w:rtl w:val="0"/>
-        </w:rPr>
-        <w:t xml:space="preserve">The Provider shall perform professional consulting services including, but not limited to [Insert Detailed Scope]. The Provider shall perform the Services with the standard of care typical for a professional in the New York market while adhering to the mandatory legal requirements of the Client's jurisdiction where applicable.</w:t>
+        </w:rPr>
+        <w:t>1. Scope of Services</w:t>
+      </w:r>
+    </w:p>
+    <w:p>
+      <w:pPr>
+        <w:spacing w:before="240" w:after="240"/>
+      </w:pPr>
+      <w:r>
+        <w:t>The Provider shall perform professional consulting services including, but not limited to [Insert Detailed Scope]. The Provider shall perform the Services with the standard of care typical for a professional in the New York market while adhering to the mandatory legal requirements of the Client's jurisdiction where applicable.</w:t>
       </w:r>
     </w:p>
     <w:p>
@@ -255,27 +243,26 @@
         <w:pStyle w:val="Heading3"/>
         <w:keepNext w:val="0"/>
         <w:keepLines w:val="0"/>
-        <w:spacing w:before="280" w:lineRule="auto"/>
-        <w:rPr>
-          <w:b w:val="1"/>
-          <w:bCs w:val="1"/>
+        <w:spacing w:before="280"/>
+        <w:rPr>
+          <w:b/>
+          <w:bCs/>
           <w:color w:val="000000"/>
           <w:sz w:val="26"/>
           <w:szCs w:val="26"/>
         </w:rPr>
       </w:pPr>
-      <w:bookmarkStart w:colFirst="0" w:colLast="0" w:name="_wwtppull872" w:id="4"/>
+      <w:bookmarkStart w:id="4" w:name="_wwtppull872" w:colFirst="0" w:colLast="0"/>
       <w:bookmarkEnd w:id="4"/>
       <w:r>
         <w:rPr>
-          <w:b w:val="1"/>
-          <w:bCs w:val="1"/>
+          <w:b/>
+          <w:bCs/>
           <w:color w:val="000000"/>
           <w:sz w:val="26"/>
           <w:szCs w:val="26"/>
-          <w:rtl w:val="0"/>
-        </w:rPr>
-        <w:t xml:space="preserve">2. Fees and Payment</w:t>
+        </w:rPr>
+        <w:t>2. Fees and Payment</w:t>
       </w:r>
     </w:p>
     <w:p>
@@ -284,35 +271,33 @@
           <w:ilvl w:val="0"/>
           <w:numId w:val="1"/>
         </w:numPr>
-        <w:spacing w:after="0" w:afterAutospacing="0" w:before="240" w:lineRule="auto"/>
-        <w:ind w:left="720" w:hanging="360"/>
-      </w:pPr>
-      <w:r>
-        <w:rPr>
-          <w:b w:val="1"/>
-          <w:bCs w:val="1"/>
-          <w:rtl w:val="0"/>
-        </w:rPr>
-        <w:t xml:space="preserve">Fixed Fee:</w:t>
-      </w:r>
-      <w:r>
-        <w:rPr>
-          <w:rtl w:val="0"/>
-        </w:rPr>
+        <w:spacing w:before="240"/>
+      </w:pPr>
+      <w:r>
+        <w:rPr>
+          <w:b/>
+          <w:bCs/>
+        </w:rPr>
+        <w:t>Fixed Fee:</w:t>
+      </w:r>
+      <w:r>
         <w:t xml:space="preserve"> The Client shall pay the Provider a total aggregate fee of </w:t>
       </w:r>
       <w:r>
         <w:rPr>
-          <w:b w:val="1"/>
-          <w:bCs w:val="1"/>
-          <w:rtl w:val="0"/>
-        </w:rPr>
-        <w:t xml:space="preserve">150,000 EUR</w:t>
-      </w:r>
-      <w:r>
-        <w:rPr>
-          <w:rtl w:val="0"/>
-        </w:rPr>
+          <w:b/>
+          <w:bCs/>
+        </w:rPr>
+        <w:t xml:space="preserve">150,000 </w:t>
+      </w:r>
+      <w:r>
+        <w:rPr>
+          <w:b/>
+          <w:bCs/>
+        </w:rPr>
+        <w:t>USD</w:t>
+      </w:r>
+      <w:r>
         <w:t xml:space="preserve"> for the duration of the term.</w:t>
       </w:r>
     </w:p>
@@ -322,22 +307,23 @@
           <w:ilvl w:val="0"/>
           <w:numId w:val="1"/>
         </w:numPr>
-        <w:spacing w:after="240" w:before="0" w:beforeAutospacing="0" w:lineRule="auto"/>
-        <w:ind w:left="720" w:hanging="360"/>
-      </w:pPr>
-      <w:r>
-        <w:rPr>
-          <w:b w:val="1"/>
-          <w:bCs w:val="1"/>
-          <w:rtl w:val="0"/>
-        </w:rPr>
-        <w:t xml:space="preserve">Currency:</w:t>
-      </w:r>
-      <w:r>
-        <w:rPr>
-          <w:rtl w:val="0"/>
-        </w:rPr>
-        <w:t xml:space="preserve"> All payments shall be made in EUR via international wire transfer.</w:t>
+        <w:spacing w:after="240"/>
+      </w:pPr>
+      <w:r>
+        <w:rPr>
+          <w:b/>
+          <w:bCs/>
+        </w:rPr>
+        <w:t>Currency:</w:t>
+      </w:r>
+      <w:r>
+        <w:t xml:space="preserve"> All payments shall be made in </w:t>
+      </w:r>
+      <w:r>
+        <w:t>USD</w:t>
+      </w:r>
+      <w:r>
+        <w:t xml:space="preserve"> via international wire transfer.</w:t>
       </w:r>
     </w:p>
     <w:p>
@@ -345,27 +331,26 @@
         <w:pStyle w:val="Heading3"/>
         <w:keepNext w:val="0"/>
         <w:keepLines w:val="0"/>
-        <w:spacing w:before="280" w:lineRule="auto"/>
-        <w:rPr>
-          <w:b w:val="1"/>
-          <w:bCs w:val="1"/>
+        <w:spacing w:before="280"/>
+        <w:rPr>
+          <w:b/>
+          <w:bCs/>
           <w:color w:val="000000"/>
           <w:sz w:val="26"/>
           <w:szCs w:val="26"/>
         </w:rPr>
       </w:pPr>
-      <w:bookmarkStart w:colFirst="0" w:colLast="0" w:name="_28ocn0i8wk5a" w:id="5"/>
+      <w:bookmarkStart w:id="5" w:name="_28ocn0i8wk5a" w:colFirst="0" w:colLast="0"/>
       <w:bookmarkEnd w:id="5"/>
       <w:r>
         <w:rPr>
-          <w:b w:val="1"/>
-          <w:bCs w:val="1"/>
+          <w:b/>
+          <w:bCs/>
           <w:color w:val="000000"/>
           <w:sz w:val="26"/>
           <w:szCs w:val="26"/>
-          <w:rtl w:val="0"/>
-        </w:rPr>
-        <w:t xml:space="preserve">3. Term and Expiration (The "Dead-Drop" Clause)</w:t>
+        </w:rPr>
+        <w:t>3. Term and Expiration (The "Dead-Drop" Clause)</w:t>
       </w:r>
     </w:p>
     <w:p>
@@ -374,35 +359,54 @@
           <w:ilvl w:val="0"/>
           <w:numId w:val="3"/>
         </w:numPr>
-        <w:spacing w:after="0" w:afterAutospacing="0" w:before="240" w:lineRule="auto"/>
-        <w:ind w:left="720" w:hanging="360"/>
-      </w:pPr>
-      <w:r>
-        <w:rPr>
-          <w:b w:val="1"/>
-          <w:bCs w:val="1"/>
-          <w:rtl w:val="0"/>
-        </w:rPr>
-        <w:t xml:space="preserve">Fixed Term:</w:t>
-      </w:r>
-      <w:r>
-        <w:rPr>
-          <w:rtl w:val="0"/>
-        </w:rPr>
+        <w:spacing w:before="240"/>
+      </w:pPr>
+      <w:r>
+        <w:rPr>
+          <w:b/>
+          <w:bCs/>
+        </w:rPr>
+        <w:t>Fixed Term:</w:t>
+      </w:r>
+      <w:r>
         <w:t xml:space="preserve"> This Agreement commences on the Effective Date and shall expire automatically at the end of </w:t>
       </w:r>
       <w:r>
         <w:rPr>
-          <w:b w:val="1"/>
-          <w:bCs w:val="1"/>
-          <w:rtl w:val="0"/>
-        </w:rPr>
-        <w:t xml:space="preserve">July 23, 2026</w:t>
-      </w:r>
-      <w:r>
-        <w:rPr>
-          <w:rtl w:val="0"/>
-        </w:rPr>
+          <w:b/>
+          <w:bCs/>
+        </w:rPr>
+        <w:t>Ju</w:t>
+      </w:r>
+      <w:r>
+        <w:rPr>
+          <w:b/>
+          <w:bCs/>
+        </w:rPr>
+        <w:t>ne</w:t>
+      </w:r>
+      <w:r>
+        <w:rPr>
+          <w:b/>
+          <w:bCs/>
+        </w:rPr>
+        <w:t xml:space="preserve"> 2</w:t>
+      </w:r>
+      <w:r>
+        <w:rPr>
+          <w:b/>
+          <w:bCs/>
+        </w:rPr>
+        <w:t>2</w:t>
+      </w:r>
+      <w:r>
+        <w:rPr>
+          <w:b/>
+          <w:bCs/>
+        </w:rPr>
+        <w:t>, 2026</w:t>
+      </w:r>
+      <w:r>
         <w:t xml:space="preserve"> (the "Expiration Date").</w:t>
       </w:r>
     </w:p>
@@ -412,35 +416,25 @@
           <w:ilvl w:val="0"/>
           <w:numId w:val="3"/>
         </w:numPr>
-        <w:spacing w:after="0" w:afterAutospacing="0" w:before="0" w:beforeAutospacing="0" w:lineRule="auto"/>
-        <w:ind w:left="720" w:hanging="360"/>
-      </w:pPr>
-      <w:r>
-        <w:rPr>
-          <w:b w:val="1"/>
-          <w:bCs w:val="1"/>
-          <w:rtl w:val="0"/>
-        </w:rPr>
-        <w:t xml:space="preserve">Non-Renewal Notice:</w:t>
-      </w:r>
-      <w:r>
-        <w:rPr>
-          <w:rtl w:val="0"/>
-        </w:rPr>
+      </w:pPr>
+      <w:r>
+        <w:rPr>
+          <w:b/>
+          <w:bCs/>
+        </w:rPr>
+        <w:t>Non-Renewal Notice:</w:t>
+      </w:r>
+      <w:r>
         <w:t xml:space="preserve"> This Agreement shall not automatically renew if either party provides written notice of non-renewal at least </w:t>
       </w:r>
       <w:r>
         <w:rPr>
-          <w:b w:val="1"/>
-          <w:bCs w:val="1"/>
-          <w:rtl w:val="0"/>
-        </w:rPr>
-        <w:t xml:space="preserve">three (3) months</w:t>
-      </w:r>
-      <w:r>
-        <w:rPr>
-          <w:rtl w:val="0"/>
-        </w:rPr>
+          <w:b/>
+          <w:bCs/>
+        </w:rPr>
+        <w:t>three (3) months</w:t>
+      </w:r>
+      <w:r>
         <w:t xml:space="preserve"> prior to the Expiration Date.</w:t>
       </w:r>
     </w:p>
@@ -450,28 +444,40 @@
           <w:ilvl w:val="0"/>
           <w:numId w:val="3"/>
         </w:numPr>
-        <w:spacing w:after="0" w:afterAutospacing="0" w:before="0" w:beforeAutospacing="0" w:lineRule="auto"/>
-        <w:ind w:left="720" w:hanging="360"/>
-      </w:pPr>
-      <w:r>
-        <w:rPr>
-          <w:rtl w:val="0"/>
-        </w:rPr>
+      </w:pPr>
+      <w:r>
         <w:t xml:space="preserve">Both parties acknowledge that the final date to serve a notice of non-renewal is </w:t>
       </w:r>
       <w:r>
         <w:rPr>
-          <w:b w:val="1"/>
-          <w:bCs w:val="1"/>
-          <w:rtl w:val="0"/>
-        </w:rPr>
-        <w:t xml:space="preserve">April 24, 2026</w:t>
-      </w:r>
-      <w:r>
-        <w:rPr>
-          <w:rtl w:val="0"/>
-        </w:rPr>
-        <w:t xml:space="preserve">.</w:t>
+          <w:b/>
+          <w:bCs/>
+        </w:rPr>
+        <w:t>March</w:t>
+      </w:r>
+      <w:r>
+        <w:rPr>
+          <w:b/>
+          <w:bCs/>
+        </w:rPr>
+        <w:t xml:space="preserve"> 2</w:t>
+      </w:r>
+      <w:r>
+        <w:rPr>
+          <w:b/>
+          <w:bCs/>
+        </w:rPr>
+        <w:t>3</w:t>
+      </w:r>
+      <w:r>
+        <w:rPr>
+          <w:b/>
+          <w:bCs/>
+        </w:rPr>
+        <w:t>, 2026</w:t>
+      </w:r>
+      <w:r>
+        <w:t>.</w:t>
       </w:r>
     </w:p>
     <w:p>
@@ -480,22 +486,21 @@
           <w:ilvl w:val="0"/>
           <w:numId w:val="3"/>
         </w:numPr>
-        <w:spacing w:after="240" w:before="0" w:beforeAutospacing="0" w:lineRule="auto"/>
-        <w:ind w:left="720" w:hanging="360"/>
-      </w:pPr>
-      <w:r>
-        <w:rPr>
-          <w:b w:val="1"/>
-          <w:bCs w:val="1"/>
-          <w:rtl w:val="0"/>
-        </w:rPr>
-        <w:t xml:space="preserve">Exclusion of § 625 BGB:</w:t>
-      </w:r>
-      <w:r>
-        <w:rPr>
-          <w:rtl w:val="0"/>
-        </w:rPr>
-        <w:t xml:space="preserve"> The parties expressly agree that any continuation of services by the Provider after the Expiration Date shall not result in a tacit renewal of the contractual relationship. Section 625 of the German Civil Code (BGB) is hereby excluded.</w:t>
+        <w:spacing w:after="240"/>
+      </w:pPr>
+      <w:r>
+        <w:rPr>
+          <w:b/>
+          <w:bCs/>
+        </w:rPr>
+        <w:t>Exclusion of § 625 BGB:</w:t>
+      </w:r>
+      <w:r>
+        <w:t xml:space="preserve"> The parties expressly agree that any continuation of services by the Provider after the Expiration Date shall not result in a tacit renewal of the </w:t>
+      </w:r>
+      <w:r>
+        <w:lastRenderedPageBreak/>
+        <w:t>contractual relationship. Section 625 of the German Civil Code (BGB) is hereby excluded.</w:t>
       </w:r>
     </w:p>
     <w:p>
@@ -503,27 +508,26 @@
         <w:pStyle w:val="Heading3"/>
         <w:keepNext w:val="0"/>
         <w:keepLines w:val="0"/>
-        <w:spacing w:before="280" w:lineRule="auto"/>
-        <w:rPr>
-          <w:b w:val="1"/>
-          <w:bCs w:val="1"/>
+        <w:spacing w:before="280"/>
+        <w:rPr>
+          <w:b/>
+          <w:bCs/>
           <w:color w:val="000000"/>
           <w:sz w:val="26"/>
           <w:szCs w:val="26"/>
         </w:rPr>
       </w:pPr>
-      <w:bookmarkStart w:colFirst="0" w:colLast="0" w:name="_qtyyekv8km1r" w:id="6"/>
+      <w:bookmarkStart w:id="6" w:name="_qtyyekv8km1r" w:colFirst="0" w:colLast="0"/>
       <w:bookmarkEnd w:id="6"/>
       <w:r>
         <w:rPr>
-          <w:b w:val="1"/>
-          <w:bCs w:val="1"/>
+          <w:b/>
+          <w:bCs/>
           <w:color w:val="000000"/>
           <w:sz w:val="26"/>
           <w:szCs w:val="26"/>
-          <w:rtl w:val="0"/>
-        </w:rPr>
-        <w:t xml:space="preserve">4. Force Majeure and Immediate Termination</w:t>
+        </w:rPr>
+        <w:t>4. Force Majeure and Immediate Termination</w:t>
       </w:r>
     </w:p>
     <w:p>
@@ -532,21 +536,16 @@
           <w:ilvl w:val="0"/>
           <w:numId w:val="2"/>
         </w:numPr>
-        <w:spacing w:after="0" w:afterAutospacing="0" w:before="240" w:lineRule="auto"/>
-        <w:ind w:left="720" w:hanging="360"/>
-      </w:pPr>
-      <w:r>
-        <w:rPr>
-          <w:b w:val="1"/>
-          <w:bCs w:val="1"/>
-          <w:rtl w:val="0"/>
-        </w:rPr>
-        <w:t xml:space="preserve">Force Majeure Event:</w:t>
-      </w:r>
-      <w:r>
-        <w:rPr>
-          <w:rtl w:val="0"/>
-        </w:rPr>
+        <w:spacing w:before="240"/>
+      </w:pPr>
+      <w:r>
+        <w:rPr>
+          <w:b/>
+          <w:bCs/>
+        </w:rPr>
+        <w:t>Force Majeure Event:</w:t>
+      </w:r>
+      <w:r>
         <w:t xml:space="preserve"> Refers to any event beyond the reasonable control of a party, including but not limited to acts of God, war, terrorism, pandemics, or government-mandated lockdowns.</w:t>
       </w:r>
     </w:p>
@@ -556,49 +555,57 @@
           <w:ilvl w:val="0"/>
           <w:numId w:val="2"/>
         </w:numPr>
-        <w:spacing w:after="240" w:before="0" w:beforeAutospacing="0" w:lineRule="auto"/>
-        <w:ind w:left="720" w:hanging="360"/>
-      </w:pPr>
-      <w:r>
-        <w:rPr>
-          <w:b w:val="1"/>
-          <w:bCs w:val="1"/>
-          <w:rtl w:val="0"/>
-        </w:rPr>
-        <w:t xml:space="preserve">Immediate Termination Right:</w:t>
-      </w:r>
-      <w:r>
-        <w:rPr>
-          <w:rtl w:val="0"/>
-        </w:rPr>
+        <w:spacing w:after="240"/>
+      </w:pPr>
+      <w:r>
+        <w:rPr>
+          <w:b/>
+          <w:bCs/>
+        </w:rPr>
+        <w:t>Immediate Termination Right:</w:t>
+      </w:r>
+      <w:r>
         <w:t xml:space="preserve"> If a Force Majeure event prevents the Provider from performing the Services for a period exceeding </w:t>
       </w:r>
       <w:r>
         <w:rPr>
-          <w:b w:val="1"/>
-          <w:bCs w:val="1"/>
-          <w:rtl w:val="0"/>
-        </w:rPr>
-        <w:t xml:space="preserve">fourteen (14) consecutive days</w:t>
-      </w:r>
-      <w:r>
-        <w:rPr>
-          <w:rtl w:val="0"/>
-        </w:rPr>
+          <w:b/>
+          <w:bCs/>
+        </w:rPr>
+        <w:t>eighteen</w:t>
+      </w:r>
+      <w:r>
+        <w:rPr>
+          <w:b/>
+          <w:bCs/>
+        </w:rPr>
+        <w:t xml:space="preserve"> (1</w:t>
+      </w:r>
+      <w:r>
+        <w:rPr>
+          <w:b/>
+          <w:bCs/>
+        </w:rPr>
+        <w:t>8</w:t>
+      </w:r>
+      <w:r>
+        <w:rPr>
+          <w:b/>
+          <w:bCs/>
+        </w:rPr>
+        <w:t>) consecutive days</w:t>
+      </w:r>
+      <w:r>
         <w:t xml:space="preserve">, the Client shall have the right to terminate this Agreement </w:t>
       </w:r>
       <w:r>
         <w:rPr>
-          <w:b w:val="1"/>
-          <w:bCs w:val="1"/>
-          <w:rtl w:val="0"/>
-        </w:rPr>
-        <w:t xml:space="preserve">immediately</w:t>
-      </w:r>
-      <w:r>
-        <w:rPr>
-          <w:rtl w:val="0"/>
-        </w:rPr>
+          <w:b/>
+          <w:bCs/>
+        </w:rPr>
+        <w:t>immediately</w:t>
+      </w:r>
+      <w:r>
         <w:t xml:space="preserve"> upon written notice, without further liability except for services already rendered.</w:t>
       </w:r>
     </w:p>
@@ -607,27 +614,26 @@
         <w:pStyle w:val="Heading3"/>
         <w:keepNext w:val="0"/>
         <w:keepLines w:val="0"/>
-        <w:spacing w:before="280" w:lineRule="auto"/>
-        <w:rPr>
-          <w:b w:val="1"/>
-          <w:bCs w:val="1"/>
+        <w:spacing w:before="280"/>
+        <w:rPr>
+          <w:b/>
+          <w:bCs/>
           <w:color w:val="000000"/>
           <w:sz w:val="26"/>
           <w:szCs w:val="26"/>
         </w:rPr>
       </w:pPr>
-      <w:bookmarkStart w:colFirst="0" w:colLast="0" w:name="_hbkngq2wtost" w:id="7"/>
+      <w:bookmarkStart w:id="7" w:name="_hbkngq2wtost" w:colFirst="0" w:colLast="0"/>
       <w:bookmarkEnd w:id="7"/>
       <w:r>
         <w:rPr>
-          <w:b w:val="1"/>
-          <w:bCs w:val="1"/>
+          <w:b/>
+          <w:bCs/>
           <w:color w:val="000000"/>
           <w:sz w:val="26"/>
           <w:szCs w:val="26"/>
-          <w:rtl w:val="0"/>
-        </w:rPr>
-        <w:t xml:space="preserve">5. Choice of Law and Jurisdiction</w:t>
+        </w:rPr>
+        <w:t>5. Choice of Law and Jurisdiction</w:t>
       </w:r>
     </w:p>
     <w:p>
@@ -636,36 +642,27 @@
           <w:ilvl w:val="0"/>
           <w:numId w:val="4"/>
         </w:numPr>
-        <w:spacing w:after="0" w:afterAutospacing="0" w:before="240" w:lineRule="auto"/>
-        <w:ind w:left="720" w:hanging="360"/>
-      </w:pPr>
-      <w:r>
-        <w:rPr>
-          <w:b w:val="1"/>
-          <w:bCs w:val="1"/>
-          <w:rtl w:val="0"/>
-        </w:rPr>
-        <w:t xml:space="preserve">Governing Law:</w:t>
-      </w:r>
-      <w:r>
-        <w:rPr>
-          <w:rtl w:val="0"/>
-        </w:rPr>
+        <w:spacing w:before="240"/>
+      </w:pPr>
+      <w:r>
+        <w:rPr>
+          <w:b/>
+          <w:bCs/>
+        </w:rPr>
+        <w:t>Governing Law:</w:t>
+      </w:r>
+      <w:r>
         <w:t xml:space="preserve"> This Agreement shall be governed by and construed in accordance with the laws of the </w:t>
       </w:r>
       <w:r>
         <w:rPr>
-          <w:b w:val="1"/>
-          <w:bCs w:val="1"/>
-          <w:rtl w:val="0"/>
-        </w:rPr>
-        <w:t xml:space="preserve">Federal Republic of Germany</w:t>
-      </w:r>
-      <w:r>
-        <w:rPr>
-          <w:rtl w:val="0"/>
-        </w:rPr>
-        <w:t xml:space="preserve">.</w:t>
+          <w:b/>
+          <w:bCs/>
+        </w:rPr>
+        <w:t>Federal Republic of Germany</w:t>
+      </w:r>
+      <w:r>
+        <w:t>.</w:t>
       </w:r>
     </w:p>
     <w:p>
@@ -674,60 +671,46 @@
           <w:ilvl w:val="0"/>
           <w:numId w:val="4"/>
         </w:numPr>
-        <w:spacing w:after="240" w:before="0" w:beforeAutospacing="0" w:lineRule="auto"/>
-        <w:ind w:left="720" w:hanging="360"/>
-      </w:pPr>
-      <w:r>
-        <w:rPr>
-          <w:b w:val="1"/>
-          <w:bCs w:val="1"/>
-          <w:rtl w:val="0"/>
-        </w:rPr>
-        <w:t xml:space="preserve">Venue:</w:t>
-      </w:r>
-      <w:r>
-        <w:rPr>
-          <w:rtl w:val="0"/>
-        </w:rPr>
+        <w:spacing w:after="240"/>
+      </w:pPr>
+      <w:r>
+        <w:rPr>
+          <w:b/>
+          <w:bCs/>
+        </w:rPr>
+        <w:t>Venue:</w:t>
+      </w:r>
+      <w:r>
         <w:t xml:space="preserve"> The exclusive place of jurisdiction for all disputes arising out of or in connection with this contract shall be </w:t>
       </w:r>
       <w:r>
         <w:rPr>
-          <w:b w:val="1"/>
-          <w:bCs w:val="1"/>
-          <w:rtl w:val="0"/>
-        </w:rPr>
-        <w:t xml:space="preserve">Berlin</w:t>
-      </w:r>
-      <w:r>
-        <w:rPr>
-          <w:rtl w:val="0"/>
-        </w:rPr>
-        <w:t xml:space="preserve">, Germany.</w:t>
-      </w:r>
-    </w:p>
-    <w:p>
-      <w:pPr>
-        <w:rPr/>
-      </w:pPr>
-      <w:r>
-        <w:rPr>
-          <w:rtl w:val="0"/>
-        </w:rPr>
-      </w:r>
-    </w:p>
+          <w:b/>
+          <w:bCs/>
+        </w:rPr>
+        <w:t>Berlin</w:t>
+      </w:r>
+      <w:r>
+        <w:t>, Germany.</w:t>
+      </w:r>
+    </w:p>
+    <w:p/>
     <w:sectPr>
-      <w:pgSz w:h="15840" w:w="12240" w:orient="portrait"/>
-      <w:pgMar w:bottom="1440" w:top="1440" w:left="1440" w:right="1440" w:header="720" w:footer="720"/>
+      <w:pgSz w:w="12240" w:h="15840"/>
+      <w:pgMar w:top="1440" w:right="1440" w:bottom="1440" w:left="1440" w:header="720" w:footer="720" w:gutter="0"/>
       <w:pgNumType w:start="1"/>
+      <w:cols w:space="720"/>
     </w:sectPr>
   </w:body>
 </w:document>
 </file>
 
 <file path=word/numbering.xml><?xml version="1.0" encoding="utf-8"?>
-<w:numbering xmlns:mc="http://schemas.openxmlformats.org/markup-compatibility/2006" xmlns:o="urn:schemas-microsoft-com:office:office" xmlns:r="http://schemas.openxmlformats.org/officeDocument/2006/relationships" xmlns:m="http://schemas.openxmlformats.org/officeDocument/2006/math" xmlns:v="urn:schemas-microsoft-com:vml" xmlns:wp="http://schemas.openxmlformats.org/drawingml/2006/wordprocessingDrawing" xmlns:w10="urn:schemas-microsoft-com:office:word" xmlns:w="http://schemas.openxmlformats.org/wordprocessingml/2006/main" xmlns:wne="http://schemas.microsoft.com/office/word/2006/wordml" xmlns:sl="http://schemas.openxmlformats.org/schemaLibrary/2006/main" xmlns:a="http://schemas.openxmlformats.org/drawingml/2006/main" xmlns:pic="http://schemas.openxmlformats.org/drawingml/2006/picture" xmlns:c="http://schemas.openxmlformats.org/drawingml/2006/chart" xmlns:lc="http://schemas.openxmlformats.org/drawingml/2006/lockedCanvas" xmlns:dgm="http://schemas.openxmlformats.org/drawingml/2006/diagram" xmlns:wps="http://schemas.microsoft.com/office/word/2010/wordprocessingShape" xmlns:wpg="http://schemas.microsoft.com/office/word/2010/wordprocessingGroup" xmlns:w14="http://schemas.microsoft.com/office/word/2010/wordml" xmlns:w15="http://schemas.microsoft.com/office/word/2012/wordml" xmlns:w16="http://schemas.microsoft.com/office/word/2018/wordml" xmlns:w16cex="http://schemas.microsoft.com/office/word/2018/wordml/cex" xmlns:w16cid="http://schemas.microsoft.com/office/word/2016/wordml/cid" xmlns="http://schemas.microsoft.com/office/tasks/2019/documenttasks" xmlns:cr="http://schemas.microsoft.com/office/comments/2020/reactions">
-  <w:abstractNum w:abstractNumId="1">
+<w:numbering xmlns:wpc="http://schemas.microsoft.com/office/word/2010/wordprocessingCanvas" xmlns:cx="http://schemas.microsoft.com/office/drawing/2014/chartex" xmlns:cx1="http://schemas.microsoft.com/office/drawing/2015/9/8/chartex" xmlns:cx2="http://schemas.microsoft.com/office/drawing/2015/10/21/chartex" xmlns:cx3="http://schemas.microsoft.com/office/drawing/2016/5/9/chartex" xmlns:cx4="http://schemas.microsoft.com/office/drawing/2016/5/10/chartex" xmlns:cx5="http://schemas.microsoft.com/office/drawing/2016/5/11/chartex" xmlns:cx6="http://schemas.microsoft.com/office/drawing/2016/5/12/chartex" xmlns:cx7="http://schemas.microsoft.com/office/drawing/2016/5/13/chartex" xmlns:cx8="http://schemas.microsoft.com/office/drawing/2016/5/14/chartex" xmlns:mc="http://schemas.openxmlformats.org/markup-compatibility/2006" xmlns:aink="http://schemas.microsoft.com/office/drawing/2016/ink" xmlns:am3d="http://schemas.microsoft.com/office/drawing/2017/model3d" xmlns:o="urn:schemas-microsoft-com:office:office" xmlns:oel="http://schemas.microsoft.com/office/2019/extlst" xmlns:r="http://schemas.openxmlformats.org/officeDocument/2006/relationships" xmlns:m="http://schemas.openxmlformats.org/officeDocument/2006/math" xmlns:v="urn:schemas-microsoft-com:vml" xmlns:wp14="http://schemas.microsoft.com/office/word/2010/wordprocessingDrawing" xmlns:wp="http://schemas.openxmlformats.org/drawingml/2006/wordprocessingDrawing" xmlns:w10="urn:schemas-microsoft-com:office:word" xmlns:w="http://schemas.openxmlformats.org/wordprocessingml/2006/main" xmlns:w14="http://schemas.microsoft.com/office/word/2010/wordml" xmlns:w15="http://schemas.microsoft.com/office/word/2012/wordml" xmlns:w16cex="http://schemas.microsoft.com/office/word/2018/wordml/cex" xmlns:w16cid="http://schemas.microsoft.com/office/word/2016/wordml/cid" xmlns:w16="http://schemas.microsoft.com/office/word/2018/wordml" xmlns:w16du="http://schemas.microsoft.com/office/word/2023/wordml/word16du" xmlns:w16sdtdh="http://schemas.microsoft.com/office/word/2020/wordml/sdtdatahash" xmlns:w16sdtfl="http://schemas.microsoft.com/office/word/2024/wordml/sdtformatlock" xmlns:w16se="http://schemas.microsoft.com/office/word/2015/wordml/symex" xmlns:wpg="http://schemas.microsoft.com/office/word/2010/wordprocessingGroup" xmlns:wpi="http://schemas.microsoft.com/office/word/2010/wordprocessingInk" xmlns:wne="http://schemas.microsoft.com/office/word/2006/wordml" xmlns:wps="http://schemas.microsoft.com/office/word/2010/wordprocessingShape" mc:Ignorable="w14 w15 w16se w16cid w16 w16cex w16sdtdh w16sdtfl w16du wp14">
+  <w:abstractNum w:abstractNumId="0" w15:restartNumberingAfterBreak="0">
+    <w:nsid w:val="05D43F95"/>
+    <w:multiLevelType w:val="multilevel"/>
+    <w:tmpl w:val="04B63250"/>
     <w:lvl w:ilvl="0">
       <w:start w:val="1"/>
       <w:numFmt w:val="bullet"/>
@@ -837,7 +820,10 @@
       </w:rPr>
     </w:lvl>
   </w:abstractNum>
-  <w:abstractNum w:abstractNumId="2">
+  <w:abstractNum w:abstractNumId="1" w15:restartNumberingAfterBreak="0">
+    <w:nsid w:val="0C461647"/>
+    <w:multiLevelType w:val="multilevel"/>
+    <w:tmpl w:val="88F0E862"/>
     <w:lvl w:ilvl="0">
       <w:start w:val="1"/>
       <w:numFmt w:val="bullet"/>
@@ -947,7 +933,10 @@
       </w:rPr>
     </w:lvl>
   </w:abstractNum>
-  <w:abstractNum w:abstractNumId="3">
+  <w:abstractNum w:abstractNumId="2" w15:restartNumberingAfterBreak="0">
+    <w:nsid w:val="1A8218D4"/>
+    <w:multiLevelType w:val="multilevel"/>
+    <w:tmpl w:val="7A988A70"/>
     <w:lvl w:ilvl="0">
       <w:start w:val="1"/>
       <w:numFmt w:val="bullet"/>
@@ -1057,7 +1046,10 @@
       </w:rPr>
     </w:lvl>
   </w:abstractNum>
-  <w:abstractNum w:abstractNumId="4">
+  <w:abstractNum w:abstractNumId="3" w15:restartNumberingAfterBreak="0">
+    <w:nsid w:val="4AB7040F"/>
+    <w:multiLevelType w:val="multilevel"/>
+    <w:tmpl w:val="CB504F20"/>
     <w:lvl w:ilvl="0">
       <w:start w:val="1"/>
       <w:numFmt w:val="bullet"/>
@@ -1167,30 +1159,30 @@
       </w:rPr>
     </w:lvl>
   </w:abstractNum>
-  <w:num w:numId="1">
-    <w:abstractNumId w:val="1"/>
+  <w:num w:numId="1" w16cid:durableId="1173950957">
+    <w:abstractNumId w:val="3"/>
   </w:num>
-  <w:num w:numId="2">
+  <w:num w:numId="2" w16cid:durableId="147598572">
+    <w:abstractNumId w:val="0"/>
+  </w:num>
+  <w:num w:numId="3" w16cid:durableId="716927190">
     <w:abstractNumId w:val="2"/>
   </w:num>
-  <w:num w:numId="3">
-    <w:abstractNumId w:val="3"/>
-  </w:num>
-  <w:num w:numId="4">
-    <w:abstractNumId w:val="4"/>
+  <w:num w:numId="4" w16cid:durableId="1472135282">
+    <w:abstractNumId w:val="1"/>
   </w:num>
 </w:numbering>
 </file>
 
 <file path=word/styles.xml><?xml version="1.0" encoding="utf-8"?>
-<w:styles xmlns:mc="http://schemas.openxmlformats.org/markup-compatibility/2006" xmlns:o="urn:schemas-microsoft-com:office:office" xmlns:r="http://schemas.openxmlformats.org/officeDocument/2006/relationships" xmlns:m="http://schemas.openxmlformats.org/officeDocument/2006/math" xmlns:v="urn:schemas-microsoft-com:vml" xmlns:wp="http://schemas.openxmlformats.org/drawingml/2006/wordprocessingDrawing" xmlns:w10="urn:schemas-microsoft-com:office:word" xmlns:w="http://schemas.openxmlformats.org/wordprocessingml/2006/main" xmlns:wne="http://schemas.microsoft.com/office/word/2006/wordml" xmlns:sl="http://schemas.openxmlformats.org/schemaLibrary/2006/main" xmlns:a="http://schemas.openxmlformats.org/drawingml/2006/main" xmlns:pic="http://schemas.openxmlformats.org/drawingml/2006/picture" xmlns:c="http://schemas.openxmlformats.org/drawingml/2006/chart" xmlns:lc="http://schemas.openxmlformats.org/drawingml/2006/lockedCanvas" xmlns:dgm="http://schemas.openxmlformats.org/drawingml/2006/diagram" xmlns:wps="http://schemas.microsoft.com/office/word/2010/wordprocessingShape" xmlns:wpg="http://schemas.microsoft.com/office/word/2010/wordprocessingGroup" xmlns:w14="http://schemas.microsoft.com/office/word/2010/wordml" xmlns:w15="http://schemas.microsoft.com/office/word/2012/wordml" xmlns:w16="http://schemas.microsoft.com/office/word/2018/wordml" xmlns:w16cex="http://schemas.microsoft.com/office/word/2018/wordml/cex" xmlns:w16cid="http://schemas.microsoft.com/office/word/2016/wordml/cid" xmlns="http://schemas.microsoft.com/office/tasks/2019/documenttasks" xmlns:cr="http://schemas.microsoft.com/office/comments/2020/reactions">
+<w:styles xmlns:mc="http://schemas.openxmlformats.org/markup-compatibility/2006" xmlns:r="http://schemas.openxmlformats.org/officeDocument/2006/relationships" xmlns:w="http://schemas.openxmlformats.org/wordprocessingml/2006/main" xmlns:w14="http://schemas.microsoft.com/office/word/2010/wordml" xmlns:w15="http://schemas.microsoft.com/office/word/2012/wordml" xmlns:w16cex="http://schemas.microsoft.com/office/word/2018/wordml/cex" xmlns:w16cid="http://schemas.microsoft.com/office/word/2016/wordml/cid" xmlns:w16="http://schemas.microsoft.com/office/word/2018/wordml" xmlns:w16du="http://schemas.microsoft.com/office/word/2023/wordml/word16du" xmlns:w16sdtdh="http://schemas.microsoft.com/office/word/2020/wordml/sdtdatahash" xmlns:w16sdtfl="http://schemas.microsoft.com/office/word/2024/wordml/sdtformatlock" xmlns:w16se="http://schemas.microsoft.com/office/word/2015/wordml/symex" mc:Ignorable="w14 w15 w16se w16cid w16 w16cex w16sdtdh w16sdtfl w16du">
   <w:docDefaults>
     <w:rPrDefault>
       <w:rPr>
-        <w:rFonts w:ascii="Arial" w:cs="Arial" w:eastAsia="Arial" w:hAnsi="Arial"/>
+        <w:rFonts w:ascii="Arial" w:eastAsia="Arial" w:hAnsi="Arial" w:cs="Arial"/>
         <w:sz w:val="22"/>
         <w:szCs w:val="22"/>
-        <w:lang w:val="en"/>
+        <w:lang w:val="en" w:eastAsia="en-US" w:bidi="ar-SA"/>
       </w:rPr>
     </w:rPrDefault>
     <w:pPrDefault>
@@ -1199,29 +1191,399 @@
       </w:pPr>
     </w:pPrDefault>
   </w:docDefaults>
-  <w:style w:type="table" w:styleId="TableNormal" w:default="1">
-    <w:name w:val="TableNormal"/>
-    <w:tblPr>
-      <w:tblCellMar>
-        <w:top w:w="100.0" w:type="dxa"/>
-        <w:left w:w="100.0" w:type="dxa"/>
-        <w:bottom w:w="100.0" w:type="dxa"/>
-        <w:right w:w="100.0" w:type="dxa"/>
-      </w:tblCellMar>
-    </w:tblPr>
-  </w:style>
-  <w:style w:type="paragraph" w:styleId="Normal" w:default="1">
-    <w:name w:val="normal"/>
+  <w:latentStyles w:defLockedState="0" w:defUIPriority="99" w:defSemiHidden="0" w:defUnhideWhenUsed="0" w:defQFormat="0" w:count="376">
+    <w:lsdException w:name="Normal" w:uiPriority="0" w:qFormat="1"/>
+    <w:lsdException w:name="heading 1" w:uiPriority="9" w:qFormat="1"/>
+    <w:lsdException w:name="heading 2" w:semiHidden="1" w:uiPriority="9" w:unhideWhenUsed="1" w:qFormat="1"/>
+    <w:lsdException w:name="heading 3" w:semiHidden="1" w:uiPriority="9" w:unhideWhenUsed="1" w:qFormat="1"/>
+    <w:lsdException w:name="heading 4" w:semiHidden="1" w:uiPriority="9" w:unhideWhenUsed="1" w:qFormat="1"/>
+    <w:lsdException w:name="heading 5" w:semiHidden="1" w:uiPriority="9" w:unhideWhenUsed="1" w:qFormat="1"/>
+    <w:lsdException w:name="heading 6" w:semiHidden="1" w:uiPriority="9" w:unhideWhenUsed="1" w:qFormat="1"/>
+    <w:lsdException w:name="heading 7" w:semiHidden="1" w:uiPriority="9" w:unhideWhenUsed="1" w:qFormat="1"/>
+    <w:lsdException w:name="heading 8" w:semiHidden="1" w:uiPriority="9" w:unhideWhenUsed="1" w:qFormat="1"/>
+    <w:lsdException w:name="heading 9" w:semiHidden="1" w:uiPriority="9" w:unhideWhenUsed="1" w:qFormat="1"/>
+    <w:lsdException w:name="index 1" w:semiHidden="1" w:unhideWhenUsed="1"/>
+    <w:lsdException w:name="index 2" w:semiHidden="1" w:unhideWhenUsed="1"/>
+    <w:lsdException w:name="index 3" w:semiHidden="1" w:unhideWhenUsed="1"/>
+    <w:lsdException w:name="index 4" w:semiHidden="1" w:unhideWhenUsed="1"/>
+    <w:lsdException w:name="index 5" w:semiHidden="1" w:unhideWhenUsed="1"/>
+    <w:lsdException w:name="index 6" w:semiHidden="1" w:unhideWhenUsed="1"/>
+    <w:lsdException w:name="index 7" w:semiHidden="1" w:unhideWhenUsed="1"/>
+    <w:lsdException w:name="index 8" w:semiHidden="1" w:unhideWhenUsed="1"/>
+    <w:lsdException w:name="index 9" w:semiHidden="1" w:unhideWhenUsed="1"/>
+    <w:lsdException w:name="toc 1" w:semiHidden="1" w:uiPriority="39" w:unhideWhenUsed="1"/>
+    <w:lsdException w:name="toc 2" w:semiHidden="1" w:uiPriority="39" w:unhideWhenUsed="1"/>
+    <w:lsdException w:name="toc 3" w:semiHidden="1" w:uiPriority="39" w:unhideWhenUsed="1"/>
+    <w:lsdException w:name="toc 4" w:semiHidden="1" w:uiPriority="39" w:unhideWhenUsed="1"/>
+    <w:lsdException w:name="toc 5" w:semiHidden="1" w:uiPriority="39" w:unhideWhenUsed="1"/>
+    <w:lsdException w:name="toc 6" w:semiHidden="1" w:uiPriority="39" w:unhideWhenUsed="1"/>
+    <w:lsdException w:name="toc 7" w:semiHidden="1" w:uiPriority="39" w:unhideWhenUsed="1"/>
+    <w:lsdException w:name="toc 8" w:semiHidden="1" w:uiPriority="39" w:unhideWhenUsed="1"/>
+    <w:lsdException w:name="toc 9" w:semiHidden="1" w:uiPriority="39" w:unhideWhenUsed="1"/>
+    <w:lsdException w:name="Normal Indent" w:semiHidden="1" w:unhideWhenUsed="1"/>
+    <w:lsdException w:name="footnote text" w:semiHidden="1" w:unhideWhenUsed="1"/>
+    <w:lsdException w:name="annotation text" w:semiHidden="1" w:unhideWhenUsed="1"/>
+    <w:lsdException w:name="header" w:semiHidden="1" w:unhideWhenUsed="1"/>
+    <w:lsdException w:name="footer" w:semiHidden="1" w:unhideWhenUsed="1"/>
+    <w:lsdException w:name="index heading" w:semiHidden="1" w:unhideWhenUsed="1"/>
+    <w:lsdException w:name="caption" w:semiHidden="1" w:uiPriority="35" w:unhideWhenUsed="1" w:qFormat="1"/>
+    <w:lsdException w:name="table of figures" w:semiHidden="1" w:unhideWhenUsed="1"/>
+    <w:lsdException w:name="envelope address" w:semiHidden="1" w:unhideWhenUsed="1"/>
+    <w:lsdException w:name="envelope return" w:semiHidden="1" w:unhideWhenUsed="1"/>
+    <w:lsdException w:name="footnote reference" w:semiHidden="1" w:unhideWhenUsed="1"/>
+    <w:lsdException w:name="annotation reference" w:semiHidden="1" w:unhideWhenUsed="1"/>
+    <w:lsdException w:name="line number" w:semiHidden="1" w:unhideWhenUsed="1"/>
+    <w:lsdException w:name="page number" w:semiHidden="1" w:unhideWhenUsed="1"/>
+    <w:lsdException w:name="endnote reference" w:semiHidden="1" w:unhideWhenUsed="1"/>
+    <w:lsdException w:name="endnote text" w:semiHidden="1" w:unhideWhenUsed="1"/>
+    <w:lsdException w:name="table of authorities" w:semiHidden="1" w:unhideWhenUsed="1"/>
+    <w:lsdException w:name="macro" w:semiHidden="1" w:unhideWhenUsed="1"/>
+    <w:lsdException w:name="toa heading" w:semiHidden="1" w:unhideWhenUsed="1"/>
+    <w:lsdException w:name="List" w:semiHidden="1" w:unhideWhenUsed="1"/>
+    <w:lsdException w:name="List Bullet" w:semiHidden="1" w:unhideWhenUsed="1"/>
+    <w:lsdException w:name="List Number" w:semiHidden="1" w:unhideWhenUsed="1"/>
+    <w:lsdException w:name="List 2" w:semiHidden="1" w:unhideWhenUsed="1"/>
+    <w:lsdException w:name="List 3" w:semiHidden="1" w:unhideWhenUsed="1"/>
+    <w:lsdException w:name="List 4" w:semiHidden="1" w:unhideWhenUsed="1"/>
+    <w:lsdException w:name="List 5" w:semiHidden="1" w:unhideWhenUsed="1"/>
+    <w:lsdException w:name="List Bullet 2" w:semiHidden="1" w:unhideWhenUsed="1"/>
+    <w:lsdException w:name="List Bullet 3" w:semiHidden="1" w:unhideWhenUsed="1"/>
+    <w:lsdException w:name="List Bullet 4" w:semiHidden="1" w:unhideWhenUsed="1"/>
+    <w:lsdException w:name="List Bullet 5" w:semiHidden="1" w:unhideWhenUsed="1"/>
+    <w:lsdException w:name="List Number 2" w:semiHidden="1" w:unhideWhenUsed="1"/>
+    <w:lsdException w:name="List Number 3" w:semiHidden="1" w:unhideWhenUsed="1"/>
+    <w:lsdException w:name="List Number 4" w:semiHidden="1" w:unhideWhenUsed="1"/>
+    <w:lsdException w:name="List Number 5" w:semiHidden="1" w:unhideWhenUsed="1"/>
+    <w:lsdException w:name="Title" w:uiPriority="10" w:qFormat="1"/>
+    <w:lsdException w:name="Closing" w:semiHidden="1" w:unhideWhenUsed="1"/>
+    <w:lsdException w:name="Signature" w:semiHidden="1" w:unhideWhenUsed="1"/>
+    <w:lsdException w:name="Default Paragraph Font" w:semiHidden="1" w:uiPriority="1" w:unhideWhenUsed="1"/>
+    <w:lsdException w:name="Body Text" w:semiHidden="1" w:unhideWhenUsed="1"/>
+    <w:lsdException w:name="Body Text Indent" w:semiHidden="1" w:unhideWhenUsed="1"/>
+    <w:lsdException w:name="List Continue" w:semiHidden="1" w:unhideWhenUsed="1"/>
+    <w:lsdException w:name="List Continue 2" w:semiHidden="1" w:unhideWhenUsed="1"/>
+    <w:lsdException w:name="List Continue 3" w:semiHidden="1" w:unhideWhenUsed="1"/>
+    <w:lsdException w:name="List Continue 4" w:semiHidden="1" w:unhideWhenUsed="1"/>
+    <w:lsdException w:name="List Continue 5" w:semiHidden="1" w:unhideWhenUsed="1"/>
+    <w:lsdException w:name="Message Header" w:semiHidden="1" w:unhideWhenUsed="1"/>
+    <w:lsdException w:name="Subtitle" w:uiPriority="11" w:qFormat="1"/>
+    <w:lsdException w:name="Salutation" w:semiHidden="1" w:unhideWhenUsed="1"/>
+    <w:lsdException w:name="Date" w:semiHidden="1" w:unhideWhenUsed="1"/>
+    <w:lsdException w:name="Body Text First Indent" w:semiHidden="1" w:unhideWhenUsed="1"/>
+    <w:lsdException w:name="Body Text First Indent 2" w:semiHidden="1" w:unhideWhenUsed="1"/>
+    <w:lsdException w:name="Note Heading" w:semiHidden="1" w:unhideWhenUsed="1"/>
+    <w:lsdException w:name="Body Text 2" w:semiHidden="1" w:unhideWhenUsed="1"/>
+    <w:lsdException w:name="Body Text 3" w:semiHidden="1" w:unhideWhenUsed="1"/>
+    <w:lsdException w:name="Body Text Indent 2" w:semiHidden="1" w:unhideWhenUsed="1"/>
+    <w:lsdException w:name="Body Text Indent 3" w:semiHidden="1" w:unhideWhenUsed="1"/>
+    <w:lsdException w:name="Block Text" w:semiHidden="1" w:unhideWhenUsed="1"/>
+    <w:lsdException w:name="Hyperlink" w:semiHidden="1" w:unhideWhenUsed="1"/>
+    <w:lsdException w:name="FollowedHyperlink" w:semiHidden="1" w:unhideWhenUsed="1"/>
+    <w:lsdException w:name="Strong" w:uiPriority="22" w:qFormat="1"/>
+    <w:lsdException w:name="Emphasis" w:uiPriority="20" w:qFormat="1"/>
+    <w:lsdException w:name="Document Map" w:semiHidden="1" w:unhideWhenUsed="1"/>
+    <w:lsdException w:name="Plain Text" w:semiHidden="1" w:unhideWhenUsed="1"/>
+    <w:lsdException w:name="E-mail Signature" w:semiHidden="1" w:unhideWhenUsed="1"/>
+    <w:lsdException w:name="HTML Top of Form" w:semiHidden="1" w:unhideWhenUsed="1"/>
+    <w:lsdException w:name="HTML Bottom of Form" w:semiHidden="1" w:unhideWhenUsed="1"/>
+    <w:lsdException w:name="Normal (Web)" w:semiHidden="1" w:unhideWhenUsed="1"/>
+    <w:lsdException w:name="HTML Acronym" w:semiHidden="1" w:unhideWhenUsed="1"/>
+    <w:lsdException w:name="HTML Address" w:semiHidden="1" w:unhideWhenUsed="1"/>
+    <w:lsdException w:name="HTML Cite" w:semiHidden="1" w:unhideWhenUsed="1"/>
+    <w:lsdException w:name="HTML Code" w:semiHidden="1" w:unhideWhenUsed="1"/>
+    <w:lsdException w:name="HTML Definition" w:semiHidden="1" w:unhideWhenUsed="1"/>
+    <w:lsdException w:name="HTML Keyboard" w:semiHidden="1" w:unhideWhenUsed="1"/>
+    <w:lsdException w:name="HTML Preformatted" w:semiHidden="1" w:unhideWhenUsed="1"/>
+    <w:lsdException w:name="HTML Sample" w:semiHidden="1" w:unhideWhenUsed="1"/>
+    <w:lsdException w:name="HTML Typewriter" w:semiHidden="1" w:unhideWhenUsed="1"/>
+    <w:lsdException w:name="HTML Variable" w:semiHidden="1" w:unhideWhenUsed="1"/>
+    <w:lsdException w:name="Normal Table" w:semiHidden="1" w:unhideWhenUsed="1"/>
+    <w:lsdException w:name="annotation subject" w:semiHidden="1" w:unhideWhenUsed="1"/>
+    <w:lsdException w:name="No List" w:semiHidden="1" w:unhideWhenUsed="1"/>
+    <w:lsdException w:name="Outline List 1" w:semiHidden="1" w:unhideWhenUsed="1"/>
+    <w:lsdException w:name="Outline List 2" w:semiHidden="1" w:unhideWhenUsed="1"/>
+    <w:lsdException w:name="Outline List 3" w:semiHidden="1" w:unhideWhenUsed="1"/>
+    <w:lsdException w:name="Table Simple 1" w:semiHidden="1" w:unhideWhenUsed="1"/>
+    <w:lsdException w:name="Table Simple 2" w:semiHidden="1" w:unhideWhenUsed="1"/>
+    <w:lsdException w:name="Table Simple 3" w:semiHidden="1" w:unhideWhenUsed="1"/>
+    <w:lsdException w:name="Table Classic 1" w:semiHidden="1" w:unhideWhenUsed="1"/>
+    <w:lsdException w:name="Table Classic 2" w:semiHidden="1" w:unhideWhenUsed="1"/>
+    <w:lsdException w:name="Table Classic 3" w:semiHidden="1" w:unhideWhenUsed="1"/>
+    <w:lsdException w:name="Table Classic 4" w:semiHidden="1" w:unhideWhenUsed="1"/>
+    <w:lsdException w:name="Table Colorful 1" w:semiHidden="1" w:unhideWhenUsed="1"/>
+    <w:lsdException w:name="Table Colorful 2" w:semiHidden="1" w:unhideWhenUsed="1"/>
+    <w:lsdException w:name="Table Colorful 3" w:semiHidden="1" w:unhideWhenUsed="1"/>
+    <w:lsdException w:name="Table Columns 1" w:semiHidden="1" w:unhideWhenUsed="1"/>
+    <w:lsdException w:name="Table Columns 2" w:semiHidden="1" w:unhideWhenUsed="1"/>
+    <w:lsdException w:name="Table Columns 3" w:semiHidden="1" w:unhideWhenUsed="1"/>
+    <w:lsdException w:name="Table Columns 4" w:semiHidden="1" w:unhideWhenUsed="1"/>
+    <w:lsdException w:name="Table Columns 5" w:semiHidden="1" w:unhideWhenUsed="1"/>
+    <w:lsdException w:name="Table Grid 1" w:semiHidden="1" w:unhideWhenUsed="1"/>
+    <w:lsdException w:name="Table Grid 2" w:semiHidden="1" w:unhideWhenUsed="1"/>
+    <w:lsdException w:name="Table Grid 3" w:semiHidden="1" w:unhideWhenUsed="1"/>
+    <w:lsdException w:name="Table Grid 4" w:semiHidden="1" w:unhideWhenUsed="1"/>
+    <w:lsdException w:name="Table Grid 5" w:semiHidden="1" w:unhideWhenUsed="1"/>
+    <w:lsdException w:name="Table Grid 6" w:semiHidden="1" w:unhideWhenUsed="1"/>
+    <w:lsdException w:name="Table Grid 7" w:semiHidden="1" w:unhideWhenUsed="1"/>
+    <w:lsdException w:name="Table Grid 8" w:semiHidden="1" w:unhideWhenUsed="1"/>
+    <w:lsdException w:name="Table List 1" w:semiHidden="1" w:unhideWhenUsed="1"/>
+    <w:lsdException w:name="Table List 2" w:semiHidden="1" w:unhideWhenUsed="1"/>
+    <w:lsdException w:name="Table List 3" w:semiHidden="1" w:unhideWhenUsed="1"/>
+    <w:lsdException w:name="Table List 4" w:semiHidden="1" w:unhideWhenUsed="1"/>
+    <w:lsdException w:name="Table List 5" w:semiHidden="1" w:unhideWhenUsed="1"/>
+    <w:lsdException w:name="Table List 6" w:semiHidden="1" w:unhideWhenUsed="1"/>
+    <w:lsdException w:name="Table List 7" w:semiHidden="1" w:unhideWhenUsed="1"/>
+    <w:lsdException w:name="Table List 8" w:semiHidden="1" w:unhideWhenUsed="1"/>
+    <w:lsdException w:name="Table 3D effects 1" w:semiHidden="1" w:unhideWhenUsed="1"/>
+    <w:lsdException w:name="Table 3D effects 2" w:semiHidden="1" w:unhideWhenUsed="1"/>
+    <w:lsdException w:name="Table 3D effects 3" w:semiHidden="1" w:unhideWhenUsed="1"/>
+    <w:lsdException w:name="Table Contemporary" w:semiHidden="1" w:unhideWhenUsed="1"/>
+    <w:lsdException w:name="Table Elegant" w:semiHidden="1" w:unhideWhenUsed="1"/>
+    <w:lsdException w:name="Table Professional" w:semiHidden="1" w:unhideWhenUsed="1"/>
+    <w:lsdException w:name="Table Subtle 1" w:semiHidden="1" w:unhideWhenUsed="1"/>
+    <w:lsdException w:name="Table Subtle 2" w:semiHidden="1" w:unhideWhenUsed="1"/>
+    <w:lsdException w:name="Table Web 1" w:semiHidden="1" w:unhideWhenUsed="1"/>
+    <w:lsdException w:name="Table Web 2" w:semiHidden="1" w:unhideWhenUsed="1"/>
+    <w:lsdException w:name="Table Web 3" w:semiHidden="1" w:unhideWhenUsed="1"/>
+    <w:lsdException w:name="Balloon Text" w:semiHidden="1" w:unhideWhenUsed="1"/>
+    <w:lsdException w:name="Table Grid" w:uiPriority="39"/>
+    <w:lsdException w:name="Table Theme" w:semiHidden="1" w:unhideWhenUsed="1"/>
+    <w:lsdException w:name="Placeholder Text" w:semiHidden="1"/>
+    <w:lsdException w:name="No Spacing" w:uiPriority="1" w:qFormat="1"/>
+    <w:lsdException w:name="Light Shading" w:uiPriority="60"/>
+    <w:lsdException w:name="Light List" w:uiPriority="61"/>
+    <w:lsdException w:name="Light Grid" w:uiPriority="62"/>
+    <w:lsdException w:name="Medium Shading 1" w:uiPriority="63"/>
+    <w:lsdException w:name="Medium Shading 2" w:uiPriority="64"/>
+    <w:lsdException w:name="Medium List 1" w:uiPriority="65"/>
+    <w:lsdException w:name="Medium List 2" w:uiPriority="66"/>
+    <w:lsdException w:name="Medium Grid 1" w:uiPriority="67"/>
+    <w:lsdException w:name="Medium Grid 2" w:uiPriority="68"/>
+    <w:lsdException w:name="Medium Grid 3" w:uiPriority="69"/>
+    <w:lsdException w:name="Dark List" w:uiPriority="70"/>
+    <w:lsdException w:name="Colorful Shading" w:uiPriority="71"/>
+    <w:lsdException w:name="Colorful List" w:uiPriority="72"/>
+    <w:lsdException w:name="Colorful Grid" w:uiPriority="73"/>
+    <w:lsdException w:name="Light Shading Accent 1" w:uiPriority="60"/>
+    <w:lsdException w:name="Light List Accent 1" w:uiPriority="61"/>
+    <w:lsdException w:name="Light Grid Accent 1" w:uiPriority="62"/>
+    <w:lsdException w:name="Medium Shading 1 Accent 1" w:uiPriority="63"/>
+    <w:lsdException w:name="Medium Shading 2 Accent 1" w:uiPriority="64"/>
+    <w:lsdException w:name="Medium List 1 Accent 1" w:uiPriority="65"/>
+    <w:lsdException w:name="Revision" w:semiHidden="1"/>
+    <w:lsdException w:name="List Paragraph" w:uiPriority="34" w:qFormat="1"/>
+    <w:lsdException w:name="Quote" w:uiPriority="29" w:qFormat="1"/>
+    <w:lsdException w:name="Intense Quote" w:uiPriority="30" w:qFormat="1"/>
+    <w:lsdException w:name="Medium List 2 Accent 1" w:uiPriority="66"/>
+    <w:lsdException w:name="Medium Grid 1 Accent 1" w:uiPriority="67"/>
+    <w:lsdException w:name="Medium Grid 2 Accent 1" w:uiPriority="68"/>
+    <w:lsdException w:name="Medium Grid 3 Accent 1" w:uiPriority="69"/>
+    <w:lsdException w:name="Dark List Accent 1" w:uiPriority="70"/>
+    <w:lsdException w:name="Colorful Shading Accent 1" w:uiPriority="71"/>
+    <w:lsdException w:name="Colorful List Accent 1" w:uiPriority="72"/>
+    <w:lsdException w:name="Colorful Grid Accent 1" w:uiPriority="73"/>
+    <w:lsdException w:name="Light Shading Accent 2" w:uiPriority="60"/>
+    <w:lsdException w:name="Light List Accent 2" w:uiPriority="61"/>
+    <w:lsdException w:name="Light Grid Accent 2" w:uiPriority="62"/>
+    <w:lsdException w:name="Medium Shading 1 Accent 2" w:uiPriority="63"/>
+    <w:lsdException w:name="Medium Shading 2 Accent 2" w:uiPriority="64"/>
+    <w:lsdException w:name="Medium List 1 Accent 2" w:uiPriority="65"/>
+    <w:lsdException w:name="Medium List 2 Accent 2" w:uiPriority="66"/>
+    <w:lsdException w:name="Medium Grid 1 Accent 2" w:uiPriority="67"/>
+    <w:lsdException w:name="Medium Grid 2 Accent 2" w:uiPriority="68"/>
+    <w:lsdException w:name="Medium Grid 3 Accent 2" w:uiPriority="69"/>
+    <w:lsdException w:name="Dark List Accent 2" w:uiPriority="70"/>
+    <w:lsdException w:name="Colorful Shading Accent 2" w:uiPriority="71"/>
+    <w:lsdException w:name="Colorful List Accent 2" w:uiPriority="72"/>
+    <w:lsdException w:name="Colorful Grid Accent 2" w:uiPriority="73"/>
+    <w:lsdException w:name="Light Shading Accent 3" w:uiPriority="60"/>
+    <w:lsdException w:name="Light List Accent 3" w:uiPriority="61"/>
+    <w:lsdException w:name="Light Grid Accent 3" w:uiPriority="62"/>
+    <w:lsdException w:name="Medium Shading 1 Accent 3" w:uiPriority="63"/>
+    <w:lsdException w:name="Medium Shading 2 Accent 3" w:uiPriority="64"/>
+    <w:lsdException w:name="Medium List 1 Accent 3" w:uiPriority="65"/>
+    <w:lsdException w:name="Medium List 2 Accent 3" w:uiPriority="66"/>
+    <w:lsdException w:name="Medium Grid 1 Accent 3" w:uiPriority="67"/>
+    <w:lsdException w:name="Medium Grid 2 Accent 3" w:uiPriority="68"/>
+    <w:lsdException w:name="Medium Grid 3 Accent 3" w:uiPriority="69"/>
+    <w:lsdException w:name="Dark List Accent 3" w:uiPriority="70"/>
+    <w:lsdException w:name="Colorful Shading Accent 3" w:uiPriority="71"/>
+    <w:lsdException w:name="Colorful List Accent 3" w:uiPriority="72"/>
+    <w:lsdException w:name="Colorful Grid Accent 3" w:uiPriority="73"/>
+    <w:lsdException w:name="Light Shading Accent 4" w:uiPriority="60"/>
+    <w:lsdException w:name="Light List Accent 4" w:uiPriority="61"/>
+    <w:lsdException w:name="Light Grid Accent 4" w:uiPriority="62"/>
+    <w:lsdException w:name="Medium Shading 1 Accent 4" w:uiPriority="63"/>
+    <w:lsdException w:name="Medium Shading 2 Accent 4" w:uiPriority="64"/>
+    <w:lsdException w:name="Medium List 1 Accent 4" w:uiPriority="65"/>
+    <w:lsdException w:name="Medium List 2 Accent 4" w:uiPriority="66"/>
+    <w:lsdException w:name="Medium Grid 1 Accent 4" w:uiPriority="67"/>
+    <w:lsdException w:name="Medium Grid 2 Accent 4" w:uiPriority="68"/>
+    <w:lsdException w:name="Medium Grid 3 Accent 4" w:uiPriority="69"/>
+    <w:lsdException w:name="Dark List Accent 4" w:uiPriority="70"/>
+    <w:lsdException w:name="Colorful Shading Accent 4" w:uiPriority="71"/>
+    <w:lsdException w:name="Colorful List Accent 4" w:uiPriority="72"/>
+    <w:lsdException w:name="Colorful Grid Accent 4" w:uiPriority="73"/>
+    <w:lsdException w:name="Light Shading Accent 5" w:uiPriority="60"/>
+    <w:lsdException w:name="Light List Accent 5" w:uiPriority="61"/>
+    <w:lsdException w:name="Light Grid Accent 5" w:uiPriority="62"/>
+    <w:lsdException w:name="Medium Shading 1 Accent 5" w:uiPriority="63"/>
+    <w:lsdException w:name="Medium Shading 2 Accent 5" w:uiPriority="64"/>
+    <w:lsdException w:name="Medium List 1 Accent 5" w:uiPriority="65"/>
+    <w:lsdException w:name="Medium List 2 Accent 5" w:uiPriority="66"/>
+    <w:lsdException w:name="Medium Grid 1 Accent 5" w:uiPriority="67"/>
+    <w:lsdException w:name="Medium Grid 2 Accent 5" w:uiPriority="68"/>
+    <w:lsdException w:name="Medium Grid 3 Accent 5" w:uiPriority="69"/>
+    <w:lsdException w:name="Dark List Accent 5" w:uiPriority="70"/>
+    <w:lsdException w:name="Colorful Shading Accent 5" w:uiPriority="71"/>
+    <w:lsdException w:name="Colorful List Accent 5" w:uiPriority="72"/>
+    <w:lsdException w:name="Colorful Grid Accent 5" w:uiPriority="73"/>
+    <w:lsdException w:name="Light Shading Accent 6" w:uiPriority="60"/>
+    <w:lsdException w:name="Light List Accent 6" w:uiPriority="61"/>
+    <w:lsdException w:name="Light Grid Accent 6" w:uiPriority="62"/>
+    <w:lsdException w:name="Medium Shading 1 Accent 6" w:uiPriority="63"/>
+    <w:lsdException w:name="Medium Shading 2 Accent 6" w:uiPriority="64"/>
+    <w:lsdException w:name="Medium List 1 Accent 6" w:uiPriority="65"/>
+    <w:lsdException w:name="Medium List 2 Accent 6" w:uiPriority="66"/>
+    <w:lsdException w:name="Medium Grid 1 Accent 6" w:uiPriority="67"/>
+    <w:lsdException w:name="Medium Grid 2 Accent 6" w:uiPriority="68"/>
+    <w:lsdException w:name="Medium Grid 3 Accent 6" w:uiPriority="69"/>
+    <w:lsdException w:name="Dark List Accent 6" w:uiPriority="70"/>
+    <w:lsdException w:name="Colorful Shading Accent 6" w:uiPriority="71"/>
+    <w:lsdException w:name="Colorful List Accent 6" w:uiPriority="72"/>
+    <w:lsdException w:name="Colorful Grid Accent 6" w:uiPriority="73"/>
+    <w:lsdException w:name="Subtle Emphasis" w:uiPriority="19" w:qFormat="1"/>
+    <w:lsdException w:name="Intense Emphasis" w:uiPriority="21" w:qFormat="1"/>
+    <w:lsdException w:name="Subtle Reference" w:uiPriority="31" w:qFormat="1"/>
+    <w:lsdException w:name="Intense Reference" w:uiPriority="32" w:qFormat="1"/>
+    <w:lsdException w:name="Book Title" w:uiPriority="33" w:qFormat="1"/>
+    <w:lsdException w:name="Bibliography" w:semiHidden="1" w:uiPriority="37" w:unhideWhenUsed="1"/>
+    <w:lsdException w:name="TOC Heading" w:semiHidden="1" w:uiPriority="39" w:unhideWhenUsed="1" w:qFormat="1"/>
+    <w:lsdException w:name="Plain Table 1" w:uiPriority="41"/>
+    <w:lsdException w:name="Plain Table 2" w:uiPriority="42"/>
+    <w:lsdException w:name="Plain Table 3" w:uiPriority="43"/>
+    <w:lsdException w:name="Plain Table 4" w:uiPriority="44"/>
+    <w:lsdException w:name="Plain Table 5" w:uiPriority="45"/>
+    <w:lsdException w:name="Grid Table Light" w:uiPriority="40"/>
+    <w:lsdException w:name="Grid Table 1 Light" w:uiPriority="46"/>
+    <w:lsdException w:name="Grid Table 2" w:uiPriority="47"/>
+    <w:lsdException w:name="Grid Table 3" w:uiPriority="48"/>
+    <w:lsdException w:name="Grid Table 4" w:uiPriority="49"/>
+    <w:lsdException w:name="Grid Table 5 Dark" w:uiPriority="50"/>
+    <w:lsdException w:name="Grid Table 6 Colorful" w:uiPriority="51"/>
+    <w:lsdException w:name="Grid Table 7 Colorful" w:uiPriority="52"/>
+    <w:lsdException w:name="Grid Table 1 Light Accent 1" w:uiPriority="46"/>
+    <w:lsdException w:name="Grid Table 2 Accent 1" w:uiPriority="47"/>
+    <w:lsdException w:name="Grid Table 3 Accent 1" w:uiPriority="48"/>
+    <w:lsdException w:name="Grid Table 4 Accent 1" w:uiPriority="49"/>
+    <w:lsdException w:name="Grid Table 5 Dark Accent 1" w:uiPriority="50"/>
+    <w:lsdException w:name="Grid Table 6 Colorful Accent 1" w:uiPriority="51"/>
+    <w:lsdException w:name="Grid Table 7 Colorful Accent 1" w:uiPriority="52"/>
+    <w:lsdException w:name="Grid Table 1 Light Accent 2" w:uiPriority="46"/>
+    <w:lsdException w:name="Grid Table 2 Accent 2" w:uiPriority="47"/>
+    <w:lsdException w:name="Grid Table 3 Accent 2" w:uiPriority="48"/>
+    <w:lsdException w:name="Grid Table 4 Accent 2" w:uiPriority="49"/>
+    <w:lsdException w:name="Grid Table 5 Dark Accent 2" w:uiPriority="50"/>
+    <w:lsdException w:name="Grid Table 6 Colorful Accent 2" w:uiPriority="51"/>
+    <w:lsdException w:name="Grid Table 7 Colorful Accent 2" w:uiPriority="52"/>
+    <w:lsdException w:name="Grid Table 1 Light Accent 3" w:uiPriority="46"/>
+    <w:lsdException w:name="Grid Table 2 Accent 3" w:uiPriority="47"/>
+    <w:lsdException w:name="Grid Table 3 Accent 3" w:uiPriority="48"/>
+    <w:lsdException w:name="Grid Table 4 Accent 3" w:uiPriority="49"/>
+    <w:lsdException w:name="Grid Table 5 Dark Accent 3" w:uiPriority="50"/>
+    <w:lsdException w:name="Grid Table 6 Colorful Accent 3" w:uiPriority="51"/>
+    <w:lsdException w:name="Grid Table 7 Colorful Accent 3" w:uiPriority="52"/>
+    <w:lsdException w:name="Grid Table 1 Light Accent 4" w:uiPriority="46"/>
+    <w:lsdException w:name="Grid Table 2 Accent 4" w:uiPriority="47"/>
+    <w:lsdException w:name="Grid Table 3 Accent 4" w:uiPriority="48"/>
+    <w:lsdException w:name="Grid Table 4 Accent 4" w:uiPriority="49"/>
+    <w:lsdException w:name="Grid Table 5 Dark Accent 4" w:uiPriority="50"/>
+    <w:lsdException w:name="Grid Table 6 Colorful Accent 4" w:uiPriority="51"/>
+    <w:lsdException w:name="Grid Table 7 Colorful Accent 4" w:uiPriority="52"/>
+    <w:lsdException w:name="Grid Table 1 Light Accent 5" w:uiPriority="46"/>
+    <w:lsdException w:name="Grid Table 2 Accent 5" w:uiPriority="47"/>
+    <w:lsdException w:name="Grid Table 3 Accent 5" w:uiPriority="48"/>
+    <w:lsdException w:name="Grid Table 4 Accent 5" w:uiPriority="49"/>
+    <w:lsdException w:name="Grid Table 5 Dark Accent 5" w:uiPriority="50"/>
+    <w:lsdException w:name="Grid Table 6 Colorful Accent 5" w:uiPriority="51"/>
+    <w:lsdException w:name="Grid Table 7 Colorful Accent 5" w:uiPriority="52"/>
+    <w:lsdException w:name="Grid Table 1 Light Accent 6" w:uiPriority="46"/>
+    <w:lsdException w:name="Grid Table 2 Accent 6" w:uiPriority="47"/>
+    <w:lsdException w:name="Grid Table 3 Accent 6" w:uiPriority="48"/>
+    <w:lsdException w:name="Grid Table 4 Accent 6" w:uiPriority="49"/>
+    <w:lsdException w:name="Grid Table 5 Dark Accent 6" w:uiPriority="50"/>
+    <w:lsdException w:name="Grid Table 6 Colorful Accent 6" w:uiPriority="51"/>
+    <w:lsdException w:name="Grid Table 7 Colorful Accent 6" w:uiPriority="52"/>
+    <w:lsdException w:name="List Table 1 Light" w:uiPriority="46"/>
+    <w:lsdException w:name="List Table 2" w:uiPriority="47"/>
+    <w:lsdException w:name="List Table 3" w:uiPriority="48"/>
+    <w:lsdException w:name="List Table 4" w:uiPriority="49"/>
+    <w:lsdException w:name="List Table 5 Dark" w:uiPriority="50"/>
+    <w:lsdException w:name="List Table 6 Colorful" w:uiPriority="51"/>
+    <w:lsdException w:name="List Table 7 Colorful" w:uiPriority="52"/>
+    <w:lsdException w:name="List Table 1 Light Accent 1" w:uiPriority="46"/>
+    <w:lsdException w:name="List Table 2 Accent 1" w:uiPriority="47"/>
+    <w:lsdException w:name="List Table 3 Accent 1" w:uiPriority="48"/>
+    <w:lsdException w:name="List Table 4 Accent 1" w:uiPriority="49"/>
+    <w:lsdException w:name="List Table 5 Dark Accent 1" w:uiPriority="50"/>
+    <w:lsdException w:name="List Table 6 Colorful Accent 1" w:uiPriority="51"/>
+    <w:lsdException w:name="List Table 7 Colorful Accent 1" w:uiPriority="52"/>
+    <w:lsdException w:name="List Table 1 Light Accent 2" w:uiPriority="46"/>
+    <w:lsdException w:name="List Table 2 Accent 2" w:uiPriority="47"/>
+    <w:lsdException w:name="List Table 3 Accent 2" w:uiPriority="48"/>
+    <w:lsdException w:name="List Table 4 Accent 2" w:uiPriority="49"/>
+    <w:lsdException w:name="List Table 5 Dark Accent 2" w:uiPriority="50"/>
+    <w:lsdException w:name="List Table 6 Colorful Accent 2" w:uiPriority="51"/>
+    <w:lsdException w:name="List Table 7 Colorful Accent 2" w:uiPriority="52"/>
+    <w:lsdException w:name="List Table 1 Light Accent 3" w:uiPriority="46"/>
+    <w:lsdException w:name="List Table 2 Accent 3" w:uiPriority="47"/>
+    <w:lsdException w:name="List Table 3 Accent 3" w:uiPriority="48"/>
+    <w:lsdException w:name="List Table 4 Accent 3" w:uiPriority="49"/>
+    <w:lsdException w:name="List Table 5 Dark Accent 3" w:uiPriority="50"/>
+    <w:lsdException w:name="List Table 6 Colorful Accent 3" w:uiPriority="51"/>
+    <w:lsdException w:name="List Table 7 Colorful Accent 3" w:uiPriority="52"/>
+    <w:lsdException w:name="List Table 1 Light Accent 4" w:uiPriority="46"/>
+    <w:lsdException w:name="List Table 2 Accent 4" w:uiPriority="47"/>
+    <w:lsdException w:name="List Table 3 Accent 4" w:uiPriority="48"/>
+    <w:lsdException w:name="List Table 4 Accent 4" w:uiPriority="49"/>
+    <w:lsdException w:name="List Table 5 Dark Accent 4" w:uiPriority="50"/>
+    <w:lsdException w:name="List Table 6 Colorful Accent 4" w:uiPriority="51"/>
+    <w:lsdException w:name="List Table 7 Colorful Accent 4" w:uiPriority="52"/>
+    <w:lsdException w:name="List Table 1 Light Accent 5" w:uiPriority="46"/>
+    <w:lsdException w:name="List Table 2 Accent 5" w:uiPriority="47"/>
+    <w:lsdException w:name="List Table 3 Accent 5" w:uiPriority="48"/>
+    <w:lsdException w:name="List Table 4 Accent 5" w:uiPriority="49"/>
+    <w:lsdException w:name="List Table 5 Dark Accent 5" w:uiPriority="50"/>
+    <w:lsdException w:name="List Table 6 Colorful Accent 5" w:uiPriority="51"/>
+    <w:lsdException w:name="List Table 7 Colorful Accent 5" w:uiPriority="52"/>
+    <w:lsdException w:name="List Table 1 Light Accent 6" w:uiPriority="46"/>
+    <w:lsdException w:name="List Table 2 Accent 6" w:uiPriority="47"/>
+    <w:lsdException w:name="List Table 3 Accent 6" w:uiPriority="48"/>
+    <w:lsdException w:name="List Table 4 Accent 6" w:uiPriority="49"/>
+    <w:lsdException w:name="List Table 5 Dark Accent 6" w:uiPriority="50"/>
+    <w:lsdException w:name="List Table 6 Colorful Accent 6" w:uiPriority="51"/>
+    <w:lsdException w:name="List Table 7 Colorful Accent 6" w:uiPriority="52"/>
+    <w:lsdException w:name="Mention" w:semiHidden="1" w:unhideWhenUsed="1"/>
+    <w:lsdException w:name="Smart Hyperlink" w:semiHidden="1" w:unhideWhenUsed="1"/>
+    <w:lsdException w:name="Hashtag" w:semiHidden="1" w:unhideWhenUsed="1"/>
+    <w:lsdException w:name="Unresolved Mention" w:semiHidden="1" w:unhideWhenUsed="1"/>
+    <w:lsdException w:name="Smart Link" w:semiHidden="1" w:unhideWhenUsed="1"/>
+  </w:latentStyles>
+  <w:style w:type="paragraph" w:default="1" w:styleId="Normal">
+    <w:name w:val="Normal"/>
+    <w:qFormat/>
   </w:style>
   <w:style w:type="paragraph" w:styleId="Heading1">
     <w:name w:val="heading 1"/>
     <w:basedOn w:val="Normal"/>
     <w:next w:val="Normal"/>
+    <w:uiPriority w:val="9"/>
+    <w:qFormat/>
     <w:pPr>
-      <w:keepNext w:val="1"/>
-      <w:keepLines w:val="1"/>
-      <w:pageBreakBefore w:val="0"/>
-      <w:spacing w:after="120" w:before="400" w:lineRule="auto"/>
+      <w:keepNext/>
+      <w:keepLines/>
+      <w:spacing w:before="400" w:after="120"/>
+      <w:outlineLvl w:val="0"/>
     </w:pPr>
     <w:rPr>
       <w:sz w:val="40"/>
@@ -1232,15 +1594,16 @@
     <w:name w:val="heading 2"/>
     <w:basedOn w:val="Normal"/>
     <w:next w:val="Normal"/>
+    <w:uiPriority w:val="9"/>
+    <w:unhideWhenUsed/>
+    <w:qFormat/>
     <w:pPr>
-      <w:keepNext w:val="1"/>
-      <w:keepLines w:val="1"/>
-      <w:pageBreakBefore w:val="0"/>
-      <w:spacing w:after="120" w:before="360" w:lineRule="auto"/>
+      <w:keepNext/>
+      <w:keepLines/>
+      <w:spacing w:before="360" w:after="120"/>
+      <w:outlineLvl w:val="1"/>
     </w:pPr>
     <w:rPr>
-      <w:b w:val="0"/>
-      <w:bCs w:val="0"/>
       <w:sz w:val="32"/>
       <w:szCs w:val="32"/>
     </w:rPr>
@@ -1249,15 +1612,16 @@
     <w:name w:val="heading 3"/>
     <w:basedOn w:val="Normal"/>
     <w:next w:val="Normal"/>
+    <w:uiPriority w:val="9"/>
+    <w:unhideWhenUsed/>
+    <w:qFormat/>
     <w:pPr>
-      <w:keepNext w:val="1"/>
-      <w:keepLines w:val="1"/>
-      <w:pageBreakBefore w:val="0"/>
-      <w:spacing w:after="80" w:before="320" w:lineRule="auto"/>
+      <w:keepNext/>
+      <w:keepLines/>
+      <w:spacing w:before="320" w:after="80"/>
+      <w:outlineLvl w:val="2"/>
     </w:pPr>
     <w:rPr>
-      <w:b w:val="0"/>
-      <w:bCs w:val="0"/>
       <w:color w:val="434343"/>
       <w:sz w:val="28"/>
       <w:szCs w:val="28"/>
@@ -1267,11 +1631,15 @@
     <w:name w:val="heading 4"/>
     <w:basedOn w:val="Normal"/>
     <w:next w:val="Normal"/>
+    <w:uiPriority w:val="9"/>
+    <w:semiHidden/>
+    <w:unhideWhenUsed/>
+    <w:qFormat/>
     <w:pPr>
-      <w:keepNext w:val="1"/>
-      <w:keepLines w:val="1"/>
-      <w:pageBreakBefore w:val="0"/>
-      <w:spacing w:after="80" w:before="280" w:lineRule="auto"/>
+      <w:keepNext/>
+      <w:keepLines/>
+      <w:spacing w:before="280" w:after="80"/>
+      <w:outlineLvl w:val="3"/>
     </w:pPr>
     <w:rPr>
       <w:color w:val="666666"/>
@@ -1283,45 +1651,88 @@
     <w:name w:val="heading 5"/>
     <w:basedOn w:val="Normal"/>
     <w:next w:val="Normal"/>
+    <w:uiPriority w:val="9"/>
+    <w:semiHidden/>
+    <w:unhideWhenUsed/>
+    <w:qFormat/>
     <w:pPr>
-      <w:keepNext w:val="1"/>
-      <w:keepLines w:val="1"/>
-      <w:pageBreakBefore w:val="0"/>
-      <w:spacing w:after="80" w:before="240" w:lineRule="auto"/>
+      <w:keepNext/>
+      <w:keepLines/>
+      <w:spacing w:before="240" w:after="80"/>
+      <w:outlineLvl w:val="4"/>
     </w:pPr>
     <w:rPr>
       <w:color w:val="666666"/>
-      <w:sz w:val="22"/>
-      <w:szCs w:val="22"/>
     </w:rPr>
   </w:style>
   <w:style w:type="paragraph" w:styleId="Heading6">
     <w:name w:val="heading 6"/>
     <w:basedOn w:val="Normal"/>
     <w:next w:val="Normal"/>
+    <w:uiPriority w:val="9"/>
+    <w:semiHidden/>
+    <w:unhideWhenUsed/>
+    <w:qFormat/>
     <w:pPr>
-      <w:keepNext w:val="1"/>
-      <w:keepLines w:val="1"/>
-      <w:pageBreakBefore w:val="0"/>
-      <w:spacing w:after="80" w:before="240" w:lineRule="auto"/>
+      <w:keepNext/>
+      <w:keepLines/>
+      <w:spacing w:before="240" w:after="80"/>
+      <w:outlineLvl w:val="5"/>
     </w:pPr>
     <w:rPr>
-      <w:i w:val="1"/>
-      <w:iCs w:val="1"/>
+      <w:i/>
+      <w:iCs/>
       <w:color w:val="666666"/>
-      <w:sz w:val="22"/>
-      <w:szCs w:val="22"/>
     </w:rPr>
+  </w:style>
+  <w:style w:type="character" w:default="1" w:styleId="DefaultParagraphFont">
+    <w:name w:val="Default Paragraph Font"/>
+    <w:uiPriority w:val="1"/>
+    <w:semiHidden/>
+    <w:unhideWhenUsed/>
+  </w:style>
+  <w:style w:type="table" w:default="1" w:styleId="TableNormal">
+    <w:name w:val="Normal Table"/>
+    <w:uiPriority w:val="99"/>
+    <w:semiHidden/>
+    <w:unhideWhenUsed/>
+    <w:tblPr>
+      <w:tblInd w:w="0" w:type="dxa"/>
+      <w:tblCellMar>
+        <w:top w:w="0" w:type="dxa"/>
+        <w:left w:w="108" w:type="dxa"/>
+        <w:bottom w:w="0" w:type="dxa"/>
+        <w:right w:w="108" w:type="dxa"/>
+      </w:tblCellMar>
+    </w:tblPr>
+  </w:style>
+  <w:style w:type="numbering" w:default="1" w:styleId="NoList">
+    <w:name w:val="No List"/>
+    <w:uiPriority w:val="99"/>
+    <w:semiHidden/>
+    <w:unhideWhenUsed/>
+  </w:style>
+  <w:style w:type="table" w:customStyle="1" w:styleId="TableNormal0">
+    <w:name w:val="TableNormal"/>
+    <w:tblPr>
+      <w:tblCellMar>
+        <w:top w:w="100" w:type="dxa"/>
+        <w:left w:w="100" w:type="dxa"/>
+        <w:bottom w:w="100" w:type="dxa"/>
+        <w:right w:w="100" w:type="dxa"/>
+      </w:tblCellMar>
+    </w:tblPr>
   </w:style>
   <w:style w:type="paragraph" w:styleId="Title">
     <w:name w:val="Title"/>
     <w:basedOn w:val="Normal"/>
     <w:next w:val="Normal"/>
+    <w:uiPriority w:val="10"/>
+    <w:qFormat/>
     <w:pPr>
-      <w:keepNext w:val="1"/>
-      <w:keepLines w:val="1"/>
-      <w:pageBreakBefore w:val="0"/>
-      <w:spacing w:after="60" w:before="0" w:lineRule="auto"/>
+      <w:keepNext/>
+      <w:keepLines/>
+      <w:spacing w:after="60"/>
     </w:pPr>
     <w:rPr>
       <w:sz w:val="52"/>
@@ -1332,16 +1743,14 @@
     <w:name w:val="Subtitle"/>
     <w:basedOn w:val="Normal"/>
     <w:next w:val="Normal"/>
+    <w:uiPriority w:val="11"/>
+    <w:qFormat/>
     <w:pPr>
-      <w:keepNext w:val="1"/>
-      <w:keepLines w:val="1"/>
-      <w:pageBreakBefore w:val="0"/>
-      <w:spacing w:after="320" w:before="0" w:lineRule="auto"/>
+      <w:keepNext/>
+      <w:keepLines/>
+      <w:spacing w:after="320"/>
     </w:pPr>
     <w:rPr>
-      <w:rFonts w:ascii="Arial" w:cs="Arial" w:eastAsia="Arial" w:hAnsi="Arial"/>
-      <w:i w:val="0"/>
-      <w:iCs w:val="0"/>
       <w:color w:val="666666"/>
       <w:sz w:val="30"/>
       <w:szCs w:val="30"/>

</xml_diff>